<commit_message>
docs(rúbrica fase 1): casos simulados y repositorio privado
Co-Authored-By: Claude Opus 5.5 <noreply@anthropic.com>
</commit_message>
<xml_diff>
--- a/RUTA_DEL_CURSO/07_EVALUACION/URPOnline_Rubrica_Evaluacion_20_Puntos.docx
+++ b/RUTA_DEL_CURSO/07_EVALUACION/URPOnline_Rubrica_Evaluacion_20_Puntos.docx
@@ -493,7 +493,7 @@
         <w:spacing w:after="40"/>
       </w:pPr>
       <w:r>
-        <w:t>Todos los integrantes participan en la sustentación: cada uno responde por el proyecto completo.</w:t>
+        <w:t>Todos los integrantes participan en el video y en la sustentación: cada uno responde por el proyecto completo.</w:t>
       </w:r>
     </w:p>
     <w:p>
@@ -589,7 +589,16 @@
         <w:spacing w:after="40"/>
       </w:pPr>
       <w:r>
-        <w:t>La prueba de carga y el experimento de búsqueda no se hacen en clase: el grupo trae sus resultados.</w:t>
+        <w:t>La prueba de carga y el experimento de búsqueda no se hacen en clase: el grupo trae sus resultados y la ejecución se ve en el video.</w:t>
+      </w:r>
+    </w:p>
+    <w:p>
+      <w:pPr>
+        <w:pStyle w:val="ListBullet"/>
+        <w:spacing w:after="40"/>
+      </w:pPr>
+      <w:r>
+        <w:t>Los casos de «Del examen a la práctica» (README de la fase) simulados en la cuenta del grupo y explicados en el video: los 10 casos.</w:t>
       </w:r>
     </w:p>
     <w:p>
@@ -616,7 +625,7 @@
         <w:t xml:space="preserve">1. </w:t>
       </w:r>
       <w:r>
-        <w:t>El alumno que no sustenta (no se presenta a la sustentación o no logra sustentar su pregunta) tiene nota 0 en este trabajo, aunque haya participado en la implementación.</w:t>
+        <w:t>El alumno que no sustenta (no se presenta a la sustentación o no logra sustentar su pregunta) tiene nota 0 en este trabajo, aunque haya participado en la implementación y en el video.</w:t>
       </w:r>
     </w:p>
     <w:p>
@@ -672,7 +681,7 @@
         <w:t xml:space="preserve">5. </w:t>
       </w:r>
       <w:r>
-        <w:t>Cero secretos expuestos. Si una contraseña, clave de AWS o token de pago aparece en GitHub, en una captura o en los logs, el indicador no se cumple.</w:t>
+        <w:t>Cero secretos expuestos. Si una contraseña, clave de AWS o token de pago aparece en GitHub, en una captura, en el video o en los logs, el indicador no se cumple.</w:t>
       </w:r>
     </w:p>
     <w:p>
@@ -713,7 +722,7 @@
         <w:pStyle w:val="Heading1"/>
       </w:pPr>
       <w:r>
-        <w:t>Bloque 1: Despliegue, AWS SDK y fallas (5 puntos)</w:t>
+        <w:t>Bloque 1: Despliegue, AWS SDK y fallas (5 puntos, todo o nada)</w:t>
       </w:r>
     </w:p>
     <w:p>
@@ -748,22 +757,30 @@
     </w:p>
     <w:p>
       <w:pPr>
-        <w:spacing w:after="80"/>
+        <w:pStyle w:val="Heading2"/>
+      </w:pPr>
+      <w:r>
+        <w:t>1a. Pipeline: primer despliegue y cambio automático</w:t>
+      </w:r>
+    </w:p>
+    <w:p>
+      <w:pPr>
+        <w:spacing w:after="60"/>
       </w:pPr>
       <w:r>
         <w:rPr>
           <w:b/>
           <w:color w:val="0B5CAD"/>
         </w:rPr>
-        <w:t xml:space="preserve">Qué hace el grupo: (1a) Pipeline: primer despliegue y cambio automático: Antes de la presentación: crear el repositorio privado del grupo con el laboratorio (pasos al inicio del README); despliegue de infra/github-oidc.yaml con su usuario de GitHub y el nombre de su repositorio (rol que GitHub usa para entrar a AWS sin claves, anexo A); secretos AWS_ROLE_ARN y DB_PASSWORD en el repositorio del grupo; primer despliegue con el pipeline (unos 25 minutos). Luego, un cambio visible en Views/Shared/_Layout.cshtml (por ejemplo, un banner de Cyber Monday), commit y push a main; el pipeline lo despliega solo y CloudFormation reemplaza las EC2 de a una, sin cortar la tienda. (1b) AWS SDK configurado y en uso, sin claves: En su PC instala la AWS CLI, configura su perfil (aws configure) y comprueba su identidad (aws sts get-caller-identity). Ubica dónde se usa el SDK: Program.cs registra los clientes de AWS (AddAWSService); Services/BusinessMetrics.cs envía OrdersCreated y OrderAmount a CloudWatch en cada venta (PutMetricData); Services/DatabaseSecret.cs lee la contraseña de la base desde Secrets Manager al arrancar (GetSecretValue). El SDK busca credenciales solo: en la PC usa el perfil; en la EC2 usa el rol IAM de la instancia, con credenciales temporales. (1c) Cae un servidor: Agrega productos al carrito, termina (destruye) una de las dos EC2 (anexo B, paso 1) y recarga la tienda varias veces. (1d) Cae una zona completa: Simula la caída de la zona A: le pone a la subred de la aplicación de esa zona (10.0.11.0/24) una NACL nueva, que bloquea todo, y fuerza el cambio de Redis a su copia (anexo B, paso 2). Mientras tanto sigue comprando. (1e) Evidencia de la caída y restauración: Reúne la evidencia de la caída de zona (anexo B, paso 3) y la restaura (paso 4).</w:t>
-      </w:r>
-      <w:r>
-        <w:t/>
-      </w:r>
-    </w:p>
-    <w:p>
-      <w:pPr>
-        <w:spacing w:after="80"/>
+        <w:t xml:space="preserve">Qué hace el grupo: </w:t>
+      </w:r>
+      <w:r>
+        <w:t>Antes de la presentación: crear el repositorio privado del grupo con el laboratorio (pasos al inicio del README); despliegue de infra/github-oidc.yaml con su usuario de GitHub y el nombre de su repositorio (rol que GitHub usa para entrar a AWS sin claves, anexo A); secretos AWS_ROLE_ARN y DB_PASSWORD en el repositorio del grupo; primer despliegue con el pipeline (unos 25 minutos). Luego, un cambio visible en Views/Shared/_Layout.cshtml (por ejemplo, un banner de Cyber Monday), commit y push a main; el pipeline lo despliega solo y CloudFormation reemplaza las EC2 de a una, sin cortar la tienda.</w:t>
+      </w:r>
+    </w:p>
+    <w:p>
+      <w:pPr>
+        <w:spacing w:after="60"/>
       </w:pPr>
       <w:r>
         <w:rPr>
@@ -773,12 +790,12 @@
         <w:t xml:space="preserve">Cómo lo demuestra: </w:t>
       </w:r>
       <w:r>
-        <w:t>(1a) Historial de Actions con el primer despliegue en verde; la pila en CREATE_COMPLETE o UPDATE_COMPLETE; la tienda por HTTPS (output ApplicationHTTPS) con «Servido por» alternando entre las dos EC2, una búsqueda por significado (por ejemplo «algo para escuchar música») y una compra. Luego el commit del cambio, la ejecución de Actions con ese mismo código (SHA) y la tienda con el cambio. (1b) Una compra y la venta en CloudWatch → Metrics → URPOnline. En la EC2 (Session Manager): no existe .aws ni variables AWS_ACCESS_KEY_ID, y aun así la app envía métricas y lee el secreto. En IAM, el rol de la EC2 con PutMetricData y GetSecretValue solo sobre ese secreto. (1c) La tienda sigue respondiendo y «Servido por» muestra solo la sobreviviente; el carrito sigue intacto; en EC2 → Auto Scaling Groups → Activity se ve el servidor terminado y el nuevo. (1d) El Target Group con la zona A en unhealthy y la zona B en healthy; una compra hecha durante la caída; en ElastiCache, el nodo principal cambiado. (1e) 1) Logs Insights: las peticiones por minuto y por servidor muestran que todas pasan a la zona B. 2) La alarma «EC2 no saludables» pasa a ALARM y vuelve a OK. 3) Reachability Analyzer (revisa la configuración sin enviar tráfico): balanceador → EC2 de la zona A no alcanzable, señalando la NACL; balanceador → EC2 de la zona B alcanzable. Tras restaurar, la zona A vuelve a ser alcanzable.</w:t>
-      </w:r>
-    </w:p>
-    <w:p>
-      <w:pPr>
-        <w:spacing w:after="80"/>
+        <w:t>Historial de Actions con el primer despliegue en verde; la pila en CREATE_COMPLETE o UPDATE_COMPLETE; la tienda por HTTPS (output ApplicationHTTPS) con «Servido por» alternando entre las dos EC2, una búsqueda por significado (por ejemplo «algo para escuchar música») y una compra. Luego el commit del cambio, la ejecución de Actions con ese mismo código (SHA) y la tienda con el cambio.</w:t>
+      </w:r>
+    </w:p>
+    <w:p>
+      <w:pPr>
+        <w:spacing w:after="60"/>
       </w:pPr>
       <w:r>
         <w:rPr>
@@ -788,7 +805,7 @@
         <w:t xml:space="preserve">Qué debe poder explicar: </w:t>
       </w:r>
       <w:r>
-        <w:t>(1a) Por qué OIDC es más seguro que guardar una Access Key en GitHub. (1b) Por qué en la EC2 no hacen falta claves; mínimo privilegio; qué pasaría si se subiera una Access Key a GitHub. (1c) Por qué el carrito no se perdió: está en Redis, no en la memoria del servidor. (1d) La diferencia entre caer un servidor y caer una zona, y por qué la tienda resiste las dos.</w:t>
+        <w:t>Por qué OIDC es más seguro que guardar una Access Key en GitHub.</w:t>
       </w:r>
     </w:p>
     <w:p>
@@ -808,7 +825,284 @@
         <w:t xml:space="preserve">Cumple si: </w:t>
       </w:r>
       <w:r>
-        <w:t>(1a) Tienda por HTTPS con balanceo, búsqueda y compra, desplegada por el pipeline, y el cambio llega solo, con commit, ejecución y tienda coincidentes. (1b) Métricas llegando desde AWS, EC2 sin claves y el rol IAM explicado; ninguna Access Key escrita en código, configuración o servidor. (1c) La tienda sigue, el carrito se mantiene y se ve el reemplazo automático. (1d) Zona A aislada, tienda vendiendo desde la zona B y failover de Redis hecho. (1e) Las tres evidencias y la restauración.</w:t>
+        <w:t>Tienda por HTTPS con balanceo, búsqueda y compra, desplegada por el pipeline, y el cambio llega solo, con commit, ejecución y tienda coincidentes.</w:t>
+      </w:r>
+    </w:p>
+    <w:p>
+      <w:pPr>
+        <w:pStyle w:val="Heading2"/>
+      </w:pPr>
+      <w:r>
+        <w:t>1b. AWS SDK configurado y en uso, sin claves</w:t>
+      </w:r>
+    </w:p>
+    <w:p>
+      <w:pPr>
+        <w:spacing w:after="60"/>
+      </w:pPr>
+      <w:r>
+        <w:rPr>
+          <w:b/>
+          <w:color w:val="0B5CAD"/>
+        </w:rPr>
+        <w:t xml:space="preserve">Qué hace el grupo: </w:t>
+      </w:r>
+      <w:r>
+        <w:t>En su PC instala la AWS CLI, configura su perfil (aws configure) y comprueba su identidad (aws sts get-caller-identity). Ubica dónde se usa el SDK: Program.cs registra los clientes de AWS (AddAWSService); Services/BusinessMetrics.cs envía OrdersCreated y OrderAmount a CloudWatch en cada venta (PutMetricData); Services/DatabaseSecret.cs lee la contraseña de la base desde Secrets Manager al arrancar (GetSecretValue). El SDK busca credenciales solo: en la PC usa el perfil; en la EC2 usa el rol IAM de la instancia, con credenciales temporales.</w:t>
+      </w:r>
+    </w:p>
+    <w:p>
+      <w:pPr>
+        <w:spacing w:after="60"/>
+      </w:pPr>
+      <w:r>
+        <w:rPr>
+          <w:b/>
+          <w:color w:val="0B5CAD"/>
+        </w:rPr>
+        <w:t xml:space="preserve">Cómo lo demuestra: </w:t>
+      </w:r>
+      <w:r>
+        <w:t>Una compra y la venta en CloudWatch → Metrics → URPOnline. En la EC2 (Session Manager): no existe .aws ni variables AWS_ACCESS_KEY_ID, y aun así la app envía métricas y lee el secreto. En IAM, el rol de la EC2 con PutMetricData y GetSecretValue solo sobre ese secreto.</w:t>
+      </w:r>
+    </w:p>
+    <w:p>
+      <w:pPr>
+        <w:spacing w:after="60"/>
+      </w:pPr>
+      <w:r>
+        <w:rPr>
+          <w:b/>
+          <w:color w:val="0B5CAD"/>
+        </w:rPr>
+        <w:t xml:space="preserve">Qué debe poder explicar: </w:t>
+      </w:r>
+      <w:r>
+        <w:t>Por qué en la EC2 no hacen falta claves; mínimo privilegio; qué pasaría si se subiera una Access Key a GitHub.</w:t>
+      </w:r>
+    </w:p>
+    <w:p>
+      <w:pPr>
+        <w:spacing w:after="200"/>
+        <w:ind w:left="170"/>
+        <w:shd w:val="clear" w:color="auto" w:fill="E8F5EC"/>
+        <w:pBdr>
+          <w:left w:val="single" w:sz="18" w:space="6" w:color="1A7F37"/>
+        </w:pBdr>
+      </w:pPr>
+      <w:r>
+        <w:rPr>
+          <w:b/>
+          <w:color w:val="1A7F37"/>
+        </w:rPr>
+        <w:t xml:space="preserve">Cumple si: </w:t>
+      </w:r>
+      <w:r>
+        <w:t>Métricas llegando desde AWS, EC2 sin claves y el rol IAM explicado; ninguna Access Key escrita en código, configuración o servidor.</w:t>
+      </w:r>
+    </w:p>
+    <w:p>
+      <w:pPr>
+        <w:pStyle w:val="Heading2"/>
+      </w:pPr>
+      <w:r>
+        <w:t>1c. Cae un servidor</w:t>
+      </w:r>
+    </w:p>
+    <w:p>
+      <w:pPr>
+        <w:spacing w:after="60"/>
+      </w:pPr>
+      <w:r>
+        <w:rPr>
+          <w:b/>
+          <w:color w:val="0B5CAD"/>
+        </w:rPr>
+        <w:t xml:space="preserve">Qué hace el grupo: </w:t>
+      </w:r>
+      <w:r>
+        <w:t>Agrega productos al carrito, termina (destruye) una de las dos EC2 (anexo B, paso 1) y recarga la tienda varias veces.</w:t>
+      </w:r>
+    </w:p>
+    <w:p>
+      <w:pPr>
+        <w:spacing w:after="60"/>
+      </w:pPr>
+      <w:r>
+        <w:rPr>
+          <w:b/>
+          <w:color w:val="0B5CAD"/>
+        </w:rPr>
+        <w:t xml:space="preserve">Cómo lo demuestra: </w:t>
+      </w:r>
+      <w:r>
+        <w:t>La tienda sigue respondiendo y «Servido por» muestra solo la sobreviviente; el carrito sigue intacto; en EC2 → Auto Scaling Groups → Activity se ve el servidor terminado y el nuevo.</w:t>
+      </w:r>
+    </w:p>
+    <w:p>
+      <w:pPr>
+        <w:spacing w:after="60"/>
+      </w:pPr>
+      <w:r>
+        <w:rPr>
+          <w:b/>
+          <w:color w:val="0B5CAD"/>
+        </w:rPr>
+        <w:t xml:space="preserve">Qué debe poder explicar: </w:t>
+      </w:r>
+      <w:r>
+        <w:t>Por qué el carrito no se perdió: está en Redis, no en la memoria del servidor.</w:t>
+      </w:r>
+    </w:p>
+    <w:p>
+      <w:pPr>
+        <w:spacing w:after="200"/>
+        <w:ind w:left="170"/>
+        <w:shd w:val="clear" w:color="auto" w:fill="E8F5EC"/>
+        <w:pBdr>
+          <w:left w:val="single" w:sz="18" w:space="6" w:color="1A7F37"/>
+        </w:pBdr>
+      </w:pPr>
+      <w:r>
+        <w:rPr>
+          <w:b/>
+          <w:color w:val="1A7F37"/>
+        </w:rPr>
+        <w:t xml:space="preserve">Cumple si: </w:t>
+      </w:r>
+      <w:r>
+        <w:t>La tienda sigue, el carrito se mantiene y se ve el reemplazo automático.</w:t>
+      </w:r>
+    </w:p>
+    <w:p>
+      <w:pPr>
+        <w:pStyle w:val="Heading2"/>
+      </w:pPr>
+      <w:r>
+        <w:t>1d. Cae una zona completa</w:t>
+      </w:r>
+    </w:p>
+    <w:p>
+      <w:pPr>
+        <w:spacing w:after="60"/>
+      </w:pPr>
+      <w:r>
+        <w:rPr>
+          <w:b/>
+          <w:color w:val="0B5CAD"/>
+        </w:rPr>
+        <w:t xml:space="preserve">Qué hace el grupo: </w:t>
+      </w:r>
+      <w:r>
+        <w:t>Simula la caída de la zona A: le pone a la subred de la aplicación de esa zona (10.0.11.0/24) una NACL nueva, que bloquea todo, y fuerza el cambio de Redis a su copia (anexo B, paso 2). Mientras tanto sigue comprando.</w:t>
+      </w:r>
+    </w:p>
+    <w:p>
+      <w:pPr>
+        <w:spacing w:after="60"/>
+      </w:pPr>
+      <w:r>
+        <w:rPr>
+          <w:b/>
+          <w:color w:val="0B5CAD"/>
+        </w:rPr>
+        <w:t xml:space="preserve">Cómo lo demuestra: </w:t>
+      </w:r>
+      <w:r>
+        <w:t>El Target Group con la zona A en unhealthy y la zona B en healthy; una compra hecha durante la caída; en ElastiCache, el nodo principal cambiado.</w:t>
+      </w:r>
+    </w:p>
+    <w:p>
+      <w:pPr>
+        <w:spacing w:after="60"/>
+      </w:pPr>
+      <w:r>
+        <w:rPr>
+          <w:b/>
+          <w:color w:val="0B5CAD"/>
+        </w:rPr>
+        <w:t xml:space="preserve">Qué debe poder explicar: </w:t>
+      </w:r>
+      <w:r>
+        <w:t>La diferencia entre caer un servidor y caer una zona, y por qué la tienda resiste las dos.</w:t>
+      </w:r>
+    </w:p>
+    <w:p>
+      <w:pPr>
+        <w:spacing w:after="200"/>
+        <w:ind w:left="170"/>
+        <w:shd w:val="clear" w:color="auto" w:fill="E8F5EC"/>
+        <w:pBdr>
+          <w:left w:val="single" w:sz="18" w:space="6" w:color="1A7F37"/>
+        </w:pBdr>
+      </w:pPr>
+      <w:r>
+        <w:rPr>
+          <w:b/>
+          <w:color w:val="1A7F37"/>
+        </w:rPr>
+        <w:t xml:space="preserve">Cumple si: </w:t>
+      </w:r>
+      <w:r>
+        <w:t>Zona A aislada, tienda vendiendo desde la zona B y failover de Redis hecho.</w:t>
+      </w:r>
+    </w:p>
+    <w:p>
+      <w:pPr>
+        <w:pStyle w:val="Heading2"/>
+      </w:pPr>
+      <w:r>
+        <w:t>1e. Evidencia de la caída y restauración</w:t>
+      </w:r>
+    </w:p>
+    <w:p>
+      <w:pPr>
+        <w:spacing w:after="60"/>
+      </w:pPr>
+      <w:r>
+        <w:rPr>
+          <w:b/>
+          <w:color w:val="0B5CAD"/>
+        </w:rPr>
+        <w:t xml:space="preserve">Qué hace el grupo: </w:t>
+      </w:r>
+      <w:r>
+        <w:t>Reúne la evidencia de la caída de zona (anexo B, paso 3) y la restaura (paso 4).</w:t>
+      </w:r>
+    </w:p>
+    <w:p>
+      <w:pPr>
+        <w:spacing w:after="60"/>
+      </w:pPr>
+      <w:r>
+        <w:rPr>
+          <w:b/>
+          <w:color w:val="0B5CAD"/>
+        </w:rPr>
+        <w:t xml:space="preserve">Cómo lo demuestra: </w:t>
+      </w:r>
+      <w:r>
+        <w:t>1) Logs Insights: las peticiones por minuto y por servidor muestran que todas pasan a la zona B. 2) La alarma «EC2 no saludables» pasa a ALARM y vuelve a OK. 3) Reachability Analyzer (revisa la configuración sin enviar tráfico): balanceador → EC2 de la zona A no alcanzable, señalando la NACL; balanceador → EC2 de la zona B alcanzable. Tras restaurar, la zona A vuelve a ser alcanzable.</w:t>
+      </w:r>
+    </w:p>
+    <w:p>
+      <w:pPr>
+        <w:spacing w:after="200"/>
+        <w:ind w:left="170"/>
+        <w:shd w:val="clear" w:color="auto" w:fill="E8F5EC"/>
+        <w:pBdr>
+          <w:left w:val="single" w:sz="18" w:space="6" w:color="1A7F37"/>
+        </w:pBdr>
+      </w:pPr>
+      <w:r>
+        <w:rPr>
+          <w:b/>
+          <w:color w:val="1A7F37"/>
+        </w:rPr>
+        <w:t xml:space="preserve">Cumple si: </w:t>
+      </w:r>
+      <w:r>
+        <w:t>Las tres evidencias y la restauración.</w:t>
       </w:r>
     </w:p>
     <w:p>
@@ -1093,7 +1387,7 @@
         <w:pStyle w:val="Heading1"/>
       </w:pPr>
       <w:r>
-        <w:t>Bloque 2: PostgreSQL: carga y búsqueda por vectores (5 puntos)</w:t>
+        <w:t>Bloque 2: PostgreSQL: carga y búsqueda por vectores (5 puntos, todo o nada)</w:t>
       </w:r>
     </w:p>
     <w:p>
@@ -1128,7 +1422,15 @@
     </w:p>
     <w:p>
       <w:pPr>
-        <w:spacing w:after="80"/>
+        <w:pStyle w:val="Heading2"/>
+      </w:pPr>
+      <w:r>
+        <w:t>2a. PgBouncer instalado por el pipeline</w:t>
+      </w:r>
+    </w:p>
+    <w:p>
+      <w:pPr>
+        <w:spacing w:after="60"/>
       </w:pPr>
       <w:r>
         <w:rPr>
@@ -1138,12 +1440,12 @@
         <w:t xml:space="preserve">Qué hace el grupo: </w:t>
       </w:r>
       <w:r>
-        <w:t>(2a) PgBouncer instalado por el pipeline: En infra/urponline-oneclick.yaml, en el arranque de las EC2 (UserData), instala PgBouncer en cada servidor, escuchando solo en 127.0.0.1:6432, en modo transaction y con pocas conexiones reales (base: scripts/pgbouncer.ini.example). Cambia la conexión de la app del 5432 al 6432. Las migraciones siguen yendo directo al 5432 (usan pg_advisory_lock, que necesita una conexión fija): se cambia en Program.cs. La contraseña sigue en Secrets Manager. (2b) Prueba de carga con k6: Con el script del anexo C (pruebas/carga.js, en el repositorio) ejecuta desde CloudShell dos pruebas iguales de 5 minutos: primero sin PgBouncer (antes del 2a) y después con PgBouncer. Anota la hora de cada una. No se hace en clase: los resultados se traen. (2c) Evidencia en CloudWatch e interpretación: Publica las métricas de PgBouncer (un script en cada EC2 consulta SHOW POOLS cada minuto y las envía a CloudWatch) y compara las dos pruebas en el dashboard (anexo C, pasos 4 a 7). (2d) Más productos por migración y vectores verificados en RDS: Crea la migración MasProductos con al menos 30 productos nuevos de por lo menos 5 categorías, con descripciones de una o dos frases que expliquen para qué sirve cada producto (anexo D). La despliega por el pipeline: al arrancar, la app aplica la migración y el indexador calcula los vectores. Luego consulta los vectores en RDS. (2e) Experimento de búsqueda e interpretación: Elige 10 búsquedas que no coincidan exactamente con ningún nombre, las prueba con el umbral 0,3 (Embeddings:MinSimilarity en appsettings.json), lo cambia a 0,6 por el pipeline y repite las mismas búsquedas (anexo D, paso 4).</w:t>
-      </w:r>
-    </w:p>
-    <w:p>
-      <w:pPr>
-        <w:spacing w:after="80"/>
+        <w:t>En infra/urponline-oneclick.yaml, en el arranque de las EC2 (UserData), instala PgBouncer en cada servidor, escuchando solo en 127.0.0.1:6432, en modo transaction y con pocas conexiones reales (base: scripts/pgbouncer.ini.example). Cambia la conexión de la app del 5432 al 6432. Las migraciones siguen yendo directo al 5432 (usan pg_advisory_lock, que necesita una conexión fija): se cambia en Program.cs. La contraseña sigue en Secrets Manager.</w:t>
+      </w:r>
+    </w:p>
+    <w:p>
+      <w:pPr>
+        <w:spacing w:after="60"/>
       </w:pPr>
       <w:r>
         <w:rPr>
@@ -1153,22 +1455,7 @@
         <w:t xml:space="preserve">Cómo lo demuestra: </w:t>
       </w:r>
       <w:r>
-        <w:t>(2a) El diff en GitHub, el pipeline en verde y, por Session Manager, systemctl status pgbouncer funcionando y la conexión de la app en el 6432 (sin la contraseña). (2b) El script en GitHub y el resumen de k6 de cada prueba: peticiones por segundo, porcentaje de errores y p95. (2c) DatabaseConnections de RDS, errores 5xx y p95/p99 del ALB, CPU de las EC2, métricas de PgBouncer (clientes, conexiones reales, clientes esperando), una alarma disparada durante la carga y la tabla comparativa. (2d) La migración en GitHub; en la tienda, los productos nuevos; en RDS (psql desde la EC2), el conteo de ProductEmbeddings igual al de productos y la consulta de los 5 productos más parecidos a uno dado, con su similitud. (2e) La tabla de las 10 búsquedas con los relacionados de cada umbral y cuántos tienen sentido.</w:t>
-      </w:r>
-    </w:p>
-    <w:p>
-      <w:pPr>
-        <w:spacing w:after="80"/>
-      </w:pPr>
-      <w:r>
-        <w:rPr>
-          <w:b/>
-          <w:color w:val="0B5CAD"/>
-        </w:rPr>
-        <w:t xml:space="preserve">Qué debe poder explicar: </w:t>
-      </w:r>
-      <w:r>
-        <w:t>(2c) La interpretación obligatoria: dónde estaba el cuello de botella y con qué métrica se prueba; qué cambió con PgBouncer y por qué; qué se ganó y qué se pagó; cuántos usuarios soporta la tienda y qué cambiarían para soportar el doble. (2d) Qué representan los 384 números y por qué la calidad de la descripción afecta la búsqueda. (2e) La interpretación obligatoria: qué umbral funciona mejor para su tienda y por qué, y qué pasa con las búsquedas que no se parecen a ningún producto.</w:t>
+        <w:t>El diff en GitHub, el pipeline en verde y, por Session Manager, systemctl status pgbouncer funcionando y la conexión de la app en el 6432 (sin la contraseña).</w:t>
       </w:r>
     </w:p>
     <w:p>
@@ -1188,7 +1475,284 @@
         <w:t xml:space="preserve">Cumple si: </w:t>
       </w:r>
       <w:r>
-        <w:t>(2a) PgBouncer en ambas EC2, desplegado por el pipeline, la app usándolo y las migraciones directas. (2b) Script en el repositorio y dos pruebas comparables, sin y con PgBouncer. (2c) Comparación completa, métricas de PgBouncer publicadas, alarma disparada e interpretación sustentada con los datos. (2d) Al menos 30 productos nuevos desplegados por el pipeline, todos con vector, y la consulta de similitud ejecutada y explicada. (2e) Tabla completa con los dos umbrales, cambio hecho por el pipeline e interpretación sustentada.</w:t>
+        <w:t>PgBouncer en ambas EC2, desplegado por el pipeline, la app usándolo y las migraciones directas.</w:t>
+      </w:r>
+    </w:p>
+    <w:p>
+      <w:pPr>
+        <w:pStyle w:val="Heading2"/>
+      </w:pPr>
+      <w:r>
+        <w:t>2b. Prueba de carga con k6</w:t>
+      </w:r>
+    </w:p>
+    <w:p>
+      <w:pPr>
+        <w:spacing w:after="60"/>
+      </w:pPr>
+      <w:r>
+        <w:rPr>
+          <w:b/>
+          <w:color w:val="0B5CAD"/>
+        </w:rPr>
+        <w:t xml:space="preserve">Qué hace el grupo: </w:t>
+      </w:r>
+      <w:r>
+        <w:t>Con el script del anexo C (pruebas/carga.js, en el repositorio) ejecuta desde CloudShell dos pruebas iguales de 5 minutos: primero sin PgBouncer (antes del 2a) y después con PgBouncer. Anota la hora de cada una. No se hace en clase: los resultados se traen y la ejecución se ve en el video.</w:t>
+      </w:r>
+    </w:p>
+    <w:p>
+      <w:pPr>
+        <w:spacing w:after="60"/>
+      </w:pPr>
+      <w:r>
+        <w:rPr>
+          <w:b/>
+          <w:color w:val="0B5CAD"/>
+        </w:rPr>
+        <w:t xml:space="preserve">Cómo lo demuestra: </w:t>
+      </w:r>
+      <w:r>
+        <w:t>El script en GitHub y el resumen de k6 de cada prueba: peticiones por segundo, porcentaje de errores y p95.</w:t>
+      </w:r>
+    </w:p>
+    <w:p>
+      <w:pPr>
+        <w:spacing w:after="200"/>
+        <w:ind w:left="170"/>
+        <w:shd w:val="clear" w:color="auto" w:fill="E8F5EC"/>
+        <w:pBdr>
+          <w:left w:val="single" w:sz="18" w:space="6" w:color="1A7F37"/>
+        </w:pBdr>
+      </w:pPr>
+      <w:r>
+        <w:rPr>
+          <w:b/>
+          <w:color w:val="1A7F37"/>
+        </w:rPr>
+        <w:t xml:space="preserve">Cumple si: </w:t>
+      </w:r>
+      <w:r>
+        <w:t>Script en el repositorio y dos pruebas comparables, sin y con PgBouncer.</w:t>
+      </w:r>
+    </w:p>
+    <w:p>
+      <w:pPr>
+        <w:pStyle w:val="Heading2"/>
+      </w:pPr>
+      <w:r>
+        <w:t>2c. Evidencia en CloudWatch e interpretación</w:t>
+      </w:r>
+    </w:p>
+    <w:p>
+      <w:pPr>
+        <w:spacing w:after="60"/>
+      </w:pPr>
+      <w:r>
+        <w:rPr>
+          <w:b/>
+          <w:color w:val="0B5CAD"/>
+        </w:rPr>
+        <w:t xml:space="preserve">Qué hace el grupo: </w:t>
+      </w:r>
+      <w:r>
+        <w:t>Publica las métricas de PgBouncer (un script en cada EC2 consulta SHOW POOLS cada minuto y las envía a CloudWatch) y compara las dos pruebas en el dashboard (anexo C, pasos 4 a 7).</w:t>
+      </w:r>
+    </w:p>
+    <w:p>
+      <w:pPr>
+        <w:spacing w:after="60"/>
+      </w:pPr>
+      <w:r>
+        <w:rPr>
+          <w:b/>
+          <w:color w:val="0B5CAD"/>
+        </w:rPr>
+        <w:t xml:space="preserve">Cómo lo demuestra: </w:t>
+      </w:r>
+      <w:r>
+        <w:t>DatabaseConnections de RDS, errores 5xx y p95/p99 del ALB, CPU de las EC2, métricas de PgBouncer (clientes, conexiones reales, clientes esperando), una alarma disparada durante la carga y la tabla comparativa.</w:t>
+      </w:r>
+    </w:p>
+    <w:p>
+      <w:pPr>
+        <w:spacing w:after="60"/>
+      </w:pPr>
+      <w:r>
+        <w:rPr>
+          <w:b/>
+          <w:color w:val="0B5CAD"/>
+        </w:rPr>
+        <w:t xml:space="preserve">Qué debe poder explicar: </w:t>
+      </w:r>
+      <w:r>
+        <w:t>La interpretación obligatoria: dónde estaba el cuello de botella y con qué métrica se prueba; qué cambió con PgBouncer y por qué; qué se ganó y qué se pagó; cuántos usuarios soporta la tienda y qué cambiarían para soportar el doble.</w:t>
+      </w:r>
+    </w:p>
+    <w:p>
+      <w:pPr>
+        <w:spacing w:after="200"/>
+        <w:ind w:left="170"/>
+        <w:shd w:val="clear" w:color="auto" w:fill="E8F5EC"/>
+        <w:pBdr>
+          <w:left w:val="single" w:sz="18" w:space="6" w:color="1A7F37"/>
+        </w:pBdr>
+      </w:pPr>
+      <w:r>
+        <w:rPr>
+          <w:b/>
+          <w:color w:val="1A7F37"/>
+        </w:rPr>
+        <w:t xml:space="preserve">Cumple si: </w:t>
+      </w:r>
+      <w:r>
+        <w:t>Comparación completa, métricas de PgBouncer publicadas, alarma disparada e interpretación sustentada con los datos.</w:t>
+      </w:r>
+    </w:p>
+    <w:p>
+      <w:pPr>
+        <w:pStyle w:val="Heading2"/>
+      </w:pPr>
+      <w:r>
+        <w:t>2d. Más productos por migración y vectores verificados en RDS</w:t>
+      </w:r>
+    </w:p>
+    <w:p>
+      <w:pPr>
+        <w:spacing w:after="60"/>
+      </w:pPr>
+      <w:r>
+        <w:rPr>
+          <w:b/>
+          <w:color w:val="0B5CAD"/>
+        </w:rPr>
+        <w:t xml:space="preserve">Qué hace el grupo: </w:t>
+      </w:r>
+      <w:r>
+        <w:t>Crea la migración MasProductos con al menos 30 productos nuevos de por lo menos 5 categorías, con descripciones de una o dos frases que expliquen para qué sirve cada producto (anexo D). La despliega por el pipeline: al arrancar, la app aplica la migración y el indexador calcula los vectores. Luego consulta los vectores en RDS.</w:t>
+      </w:r>
+    </w:p>
+    <w:p>
+      <w:pPr>
+        <w:spacing w:after="60"/>
+      </w:pPr>
+      <w:r>
+        <w:rPr>
+          <w:b/>
+          <w:color w:val="0B5CAD"/>
+        </w:rPr>
+        <w:t xml:space="preserve">Cómo lo demuestra: </w:t>
+      </w:r>
+      <w:r>
+        <w:t>La migración en GitHub; en la tienda, los productos nuevos; en RDS (psql desde la EC2), el conteo de ProductEmbeddings igual al de productos y la consulta de los 5 productos más parecidos a uno dado, con su similitud.</w:t>
+      </w:r>
+    </w:p>
+    <w:p>
+      <w:pPr>
+        <w:spacing w:after="60"/>
+      </w:pPr>
+      <w:r>
+        <w:rPr>
+          <w:b/>
+          <w:color w:val="0B5CAD"/>
+        </w:rPr>
+        <w:t xml:space="preserve">Qué debe poder explicar: </w:t>
+      </w:r>
+      <w:r>
+        <w:t>Qué representan los 384 números y por qué la calidad de la descripción afecta la búsqueda.</w:t>
+      </w:r>
+    </w:p>
+    <w:p>
+      <w:pPr>
+        <w:spacing w:after="200"/>
+        <w:ind w:left="170"/>
+        <w:shd w:val="clear" w:color="auto" w:fill="E8F5EC"/>
+        <w:pBdr>
+          <w:left w:val="single" w:sz="18" w:space="6" w:color="1A7F37"/>
+        </w:pBdr>
+      </w:pPr>
+      <w:r>
+        <w:rPr>
+          <w:b/>
+          <w:color w:val="1A7F37"/>
+        </w:rPr>
+        <w:t xml:space="preserve">Cumple si: </w:t>
+      </w:r>
+      <w:r>
+        <w:t>Al menos 30 productos nuevos desplegados por el pipeline, todos con vector, y la consulta de similitud ejecutada y explicada.</w:t>
+      </w:r>
+    </w:p>
+    <w:p>
+      <w:pPr>
+        <w:pStyle w:val="Heading2"/>
+      </w:pPr>
+      <w:r>
+        <w:t>2e. Experimento de búsqueda e interpretación</w:t>
+      </w:r>
+    </w:p>
+    <w:p>
+      <w:pPr>
+        <w:spacing w:after="60"/>
+      </w:pPr>
+      <w:r>
+        <w:rPr>
+          <w:b/>
+          <w:color w:val="0B5CAD"/>
+        </w:rPr>
+        <w:t xml:space="preserve">Qué hace el grupo: </w:t>
+      </w:r>
+      <w:r>
+        <w:t>Elige 10 búsquedas que no coincidan exactamente con ningún nombre, las prueba con el umbral 0,3 (Embeddings:MinSimilarity en appsettings.json), lo cambia a 0,6 por el pipeline y repite las mismas búsquedas (anexo D, paso 4).</w:t>
+      </w:r>
+    </w:p>
+    <w:p>
+      <w:pPr>
+        <w:spacing w:after="60"/>
+      </w:pPr>
+      <w:r>
+        <w:rPr>
+          <w:b/>
+          <w:color w:val="0B5CAD"/>
+        </w:rPr>
+        <w:t xml:space="preserve">Cómo lo demuestra: </w:t>
+      </w:r>
+      <w:r>
+        <w:t>La tabla de las 10 búsquedas con los relacionados de cada umbral y cuántos tienen sentido.</w:t>
+      </w:r>
+    </w:p>
+    <w:p>
+      <w:pPr>
+        <w:spacing w:after="60"/>
+      </w:pPr>
+      <w:r>
+        <w:rPr>
+          <w:b/>
+          <w:color w:val="0B5CAD"/>
+        </w:rPr>
+        <w:t xml:space="preserve">Qué debe poder explicar: </w:t>
+      </w:r>
+      <w:r>
+        <w:t>La interpretación obligatoria: qué umbral funciona mejor para su tienda y por qué, y qué pasa con las búsquedas que no se parecen a ningún producto.</w:t>
+      </w:r>
+    </w:p>
+    <w:p>
+      <w:pPr>
+        <w:spacing w:after="200"/>
+        <w:ind w:left="170"/>
+        <w:shd w:val="clear" w:color="auto" w:fill="E8F5EC"/>
+        <w:pBdr>
+          <w:left w:val="single" w:sz="18" w:space="6" w:color="1A7F37"/>
+        </w:pBdr>
+      </w:pPr>
+      <w:r>
+        <w:rPr>
+          <w:b/>
+          <w:color w:val="1A7F37"/>
+        </w:rPr>
+        <w:t xml:space="preserve">Cumple si: </w:t>
+      </w:r>
+      <w:r>
+        <w:t>Tabla completa con los dos umbrales, cambio hecho por el pipeline e interpretación sustentada.</w:t>
       </w:r>
     </w:p>
     <w:p>
@@ -1508,7 +2072,7 @@
         <w:pStyle w:val="Heading1"/>
       </w:pPr>
       <w:r>
-        <w:t>Bloque 3: Carrito y pago (5 puntos)</w:t>
+        <w:t>Bloque 3: Carrito y pago (5 puntos, todo o nada)</w:t>
       </w:r>
     </w:p>
     <w:p>
@@ -1543,7 +2107,15 @@
     </w:p>
     <w:p>
       <w:pPr>
-        <w:spacing w:after="80"/>
+        <w:pStyle w:val="Heading2"/>
+      </w:pPr>
+      <w:r>
+        <w:t>3a. Métricas del carrito con el AWS SDK</w:t>
+      </w:r>
+    </w:p>
+    <w:p>
+      <w:pPr>
+        <w:spacing w:after="60"/>
       </w:pPr>
       <w:r>
         <w:rPr>
@@ -1553,12 +2125,12 @@
         <w:t xml:space="preserve">Qué hace el grupo: </w:t>
       </w:r>
       <w:r>
-        <w:t>(3a) Métricas del carrito con el AWS SDK: CartItemsAdded: cada «Agregar al carrito» (desde Controllers/CartController.cs). ActiveCarts: personas distintas que agregaron algo en los últimos 5 minutos; diseño sugerido: anotar en Redis cada sesión con la hora de su última actividad y cada minuto contar las de los últimos 5 minutos. Nunca se registra el identificador de sesión tal cual: se usa un hash. (3b) Gráfica, alarma y usuarios simulados: En el YAML: una gráfica con carritos activos y compras juntos (la conversión) y una alarma de carritos abandonados (carritos activos y 0 compras durante 15 minutos). Con k6 simula unos 30 clientes que agregan al carrito sin pagar (cada uno con su sesión y el token del formulario). (3c) Credenciales de pago seguras: Crea su aplicación y cuentas de prueba en Mercado Pago y guarda el token de prueba en Secrets Manager (secreto creado por el YAML sin el valor, con permiso de lectura para el rol de la EC2). La app lo lee con el AWS SDK. (3d) Pago con tarjeta de prueba: En Controllers/CheckoutController.cs, después de guardar el pedido, la tienda pide a Mercado Pago el link de pago (con el número de pedido y la dirección de regreso) y lleva al cliente a pagar. (3e) Confirmación segura al volver: Al regresar, la tienda consulta el pago a Mercado Pago desde el servidor y solo si está aprobado marca PAGADO. Si el cliente recarga la página, nada se registra dos veces.</w:t>
-      </w:r>
-    </w:p>
-    <w:p>
-      <w:pPr>
-        <w:spacing w:after="80"/>
+        <w:t>CartItemsAdded: cada «Agregar al carrito» (desde Controllers/CartController.cs). ActiveCarts: personas distintas que agregaron algo en los últimos 5 minutos; diseño sugerido: anotar en Redis cada sesión con la hora de su última actividad y cada minuto contar las de los últimos 5 minutos. Nunca se registra el identificador de sesión tal cual: se usa un hash.</w:t>
+      </w:r>
+    </w:p>
+    <w:p>
+      <w:pPr>
+        <w:spacing w:after="60"/>
       </w:pPr>
       <w:r>
         <w:rPr>
@@ -1568,22 +2140,7 @@
         <w:t xml:space="preserve">Cómo lo demuestra: </w:t>
       </w:r>
       <w:r>
-        <w:t>(3a) Las dos métricas con datos en CloudWatch → Metrics → URPOnline, agregando productos desde varios navegadores. (3b) ActiveCarts sube a unos 30, OrdersCreated queda en 0, la alarma se activa; una compra real la devuelve a OK. (3c) El secreto en Secrets Manager (sin el valor); el token no aparece en GitHub ni en la EC2. (3d) Compra, paga con el comprador de prueba y una tarjeta de prueba, y vuelve a la tienda. (3e) Con titular APRO el pedido pasa a PAGADO; con OTHE o FUND queda en PENDIENTE_PAGO y el cliente ve el rechazo; al recargar, nada se duplica.</w:t>
-      </w:r>
-    </w:p>
-    <w:p>
-      <w:pPr>
-        <w:spacing w:after="80"/>
-      </w:pPr>
-      <w:r>
-        <w:rPr>
-          <w:b/>
-          <w:color w:val="0B5CAD"/>
-        </w:rPr>
-        <w:t xml:space="preserve">Qué debe poder explicar: </w:t>
-      </w:r>
-      <w:r>
-        <w:t>(3e) El límite del diseño: si el cliente paga y cierra el navegador antes de volver, el pedido queda en PENDIENTE_PAGO.</w:t>
+        <w:t>Las dos métricas con datos en CloudWatch → Metrics → URPOnline, agregando productos desde varios navegadores.</w:t>
       </w:r>
     </w:p>
     <w:p>
@@ -1603,7 +2160,254 @@
         <w:t xml:space="preserve">Cumple si: </w:t>
       </w:r>
       <w:r>
-        <w:t>(3a) Las dos métricas con datos correctos (ActiveCarts cuenta personas, no clics). (3b) Gráfica y alarma creadas desde el YAML, y la simulación activa y recupera la alarma. (3c) El token solo está en Secrets Manager, creado y autorizado desde el YAML. (3d) El ciclo completo funciona, solo con elementos de prueba. (3e) Consulta el pago desde el servidor, distingue aprobado y rechazado y no duplica.</w:t>
+        <w:t>Las dos métricas con datos correctos (ActiveCarts cuenta personas, no clics).</w:t>
+      </w:r>
+    </w:p>
+    <w:p>
+      <w:pPr>
+        <w:pStyle w:val="Heading2"/>
+      </w:pPr>
+      <w:r>
+        <w:t>3b. Gráfica, alarma y usuarios simulados</w:t>
+      </w:r>
+    </w:p>
+    <w:p>
+      <w:pPr>
+        <w:spacing w:after="60"/>
+      </w:pPr>
+      <w:r>
+        <w:rPr>
+          <w:b/>
+          <w:color w:val="0B5CAD"/>
+        </w:rPr>
+        <w:t xml:space="preserve">Qué hace el grupo: </w:t>
+      </w:r>
+      <w:r>
+        <w:t>En el YAML: una gráfica con carritos activos y compras juntos (la conversión) y una alarma de carritos abandonados (carritos activos y 0 compras durante 15 minutos). Con k6 simula unos 30 clientes que agregan al carrito sin pagar (cada uno con su sesión y el token del formulario).</w:t>
+      </w:r>
+    </w:p>
+    <w:p>
+      <w:pPr>
+        <w:spacing w:after="60"/>
+      </w:pPr>
+      <w:r>
+        <w:rPr>
+          <w:b/>
+          <w:color w:val="0B5CAD"/>
+        </w:rPr>
+        <w:t xml:space="preserve">Cómo lo demuestra: </w:t>
+      </w:r>
+      <w:r>
+        <w:t>ActiveCarts sube a unos 30, OrdersCreated queda en 0, la alarma se activa; una compra real la devuelve a OK.</w:t>
+      </w:r>
+    </w:p>
+    <w:p>
+      <w:pPr>
+        <w:spacing w:after="200"/>
+        <w:ind w:left="170"/>
+        <w:shd w:val="clear" w:color="auto" w:fill="E8F5EC"/>
+        <w:pBdr>
+          <w:left w:val="single" w:sz="18" w:space="6" w:color="1A7F37"/>
+        </w:pBdr>
+      </w:pPr>
+      <w:r>
+        <w:rPr>
+          <w:b/>
+          <w:color w:val="1A7F37"/>
+        </w:rPr>
+        <w:t xml:space="preserve">Cumple si: </w:t>
+      </w:r>
+      <w:r>
+        <w:t>Gráfica y alarma creadas desde el YAML, y la simulación activa y recupera la alarma.</w:t>
+      </w:r>
+    </w:p>
+    <w:p>
+      <w:pPr>
+        <w:pStyle w:val="Heading2"/>
+      </w:pPr>
+      <w:r>
+        <w:t>3c. Credenciales de pago seguras</w:t>
+      </w:r>
+    </w:p>
+    <w:p>
+      <w:pPr>
+        <w:spacing w:after="60"/>
+      </w:pPr>
+      <w:r>
+        <w:rPr>
+          <w:b/>
+          <w:color w:val="0B5CAD"/>
+        </w:rPr>
+        <w:t xml:space="preserve">Qué hace el grupo: </w:t>
+      </w:r>
+      <w:r>
+        <w:t>Crea su aplicación y cuentas de prueba en Mercado Pago y guarda el token de prueba en Secrets Manager (secreto creado por el YAML sin el valor, con permiso de lectura para el rol de la EC2). La app lo lee con el AWS SDK.</w:t>
+      </w:r>
+    </w:p>
+    <w:p>
+      <w:pPr>
+        <w:spacing w:after="60"/>
+      </w:pPr>
+      <w:r>
+        <w:rPr>
+          <w:b/>
+          <w:color w:val="0B5CAD"/>
+        </w:rPr>
+        <w:t xml:space="preserve">Cómo lo demuestra: </w:t>
+      </w:r>
+      <w:r>
+        <w:t>El secreto en Secrets Manager (sin el valor); el token no aparece en GitHub ni en la EC2.</w:t>
+      </w:r>
+    </w:p>
+    <w:p>
+      <w:pPr>
+        <w:spacing w:after="200"/>
+        <w:ind w:left="170"/>
+        <w:shd w:val="clear" w:color="auto" w:fill="E8F5EC"/>
+        <w:pBdr>
+          <w:left w:val="single" w:sz="18" w:space="6" w:color="1A7F37"/>
+        </w:pBdr>
+      </w:pPr>
+      <w:r>
+        <w:rPr>
+          <w:b/>
+          <w:color w:val="1A7F37"/>
+        </w:rPr>
+        <w:t xml:space="preserve">Cumple si: </w:t>
+      </w:r>
+      <w:r>
+        <w:t>El token solo está en Secrets Manager, creado y autorizado desde el YAML.</w:t>
+      </w:r>
+    </w:p>
+    <w:p>
+      <w:pPr>
+        <w:pStyle w:val="Heading2"/>
+      </w:pPr>
+      <w:r>
+        <w:t>3d. Pago con tarjeta de prueba</w:t>
+      </w:r>
+    </w:p>
+    <w:p>
+      <w:pPr>
+        <w:spacing w:after="60"/>
+      </w:pPr>
+      <w:r>
+        <w:rPr>
+          <w:b/>
+          <w:color w:val="0B5CAD"/>
+        </w:rPr>
+        <w:t xml:space="preserve">Qué hace el grupo: </w:t>
+      </w:r>
+      <w:r>
+        <w:t>En Controllers/CheckoutController.cs, después de guardar el pedido, la tienda pide a Mercado Pago el link de pago (con el número de pedido y la dirección de regreso) y lleva al cliente a pagar.</w:t>
+      </w:r>
+    </w:p>
+    <w:p>
+      <w:pPr>
+        <w:spacing w:after="60"/>
+      </w:pPr>
+      <w:r>
+        <w:rPr>
+          <w:b/>
+          <w:color w:val="0B5CAD"/>
+        </w:rPr>
+        <w:t xml:space="preserve">Cómo lo demuestra: </w:t>
+      </w:r>
+      <w:r>
+        <w:t>Compra, paga con el comprador de prueba y una tarjeta de prueba, y vuelve a la tienda.</w:t>
+      </w:r>
+    </w:p>
+    <w:p>
+      <w:pPr>
+        <w:spacing w:after="200"/>
+        <w:ind w:left="170"/>
+        <w:shd w:val="clear" w:color="auto" w:fill="E8F5EC"/>
+        <w:pBdr>
+          <w:left w:val="single" w:sz="18" w:space="6" w:color="1A7F37"/>
+        </w:pBdr>
+      </w:pPr>
+      <w:r>
+        <w:rPr>
+          <w:b/>
+          <w:color w:val="1A7F37"/>
+        </w:rPr>
+        <w:t xml:space="preserve">Cumple si: </w:t>
+      </w:r>
+      <w:r>
+        <w:t>El ciclo completo funciona, solo con elementos de prueba.</w:t>
+      </w:r>
+    </w:p>
+    <w:p>
+      <w:pPr>
+        <w:pStyle w:val="Heading2"/>
+      </w:pPr>
+      <w:r>
+        <w:t>3e. Confirmación segura al volver</w:t>
+      </w:r>
+    </w:p>
+    <w:p>
+      <w:pPr>
+        <w:spacing w:after="60"/>
+      </w:pPr>
+      <w:r>
+        <w:rPr>
+          <w:b/>
+          <w:color w:val="0B5CAD"/>
+        </w:rPr>
+        <w:t xml:space="preserve">Qué hace el grupo: </w:t>
+      </w:r>
+      <w:r>
+        <w:t>Al regresar, la tienda consulta el pago a Mercado Pago desde el servidor y solo si está aprobado marca PAGADO. Si el cliente recarga la página, nada se registra dos veces.</w:t>
+      </w:r>
+    </w:p>
+    <w:p>
+      <w:pPr>
+        <w:spacing w:after="60"/>
+      </w:pPr>
+      <w:r>
+        <w:rPr>
+          <w:b/>
+          <w:color w:val="0B5CAD"/>
+        </w:rPr>
+        <w:t xml:space="preserve">Cómo lo demuestra: </w:t>
+      </w:r>
+      <w:r>
+        <w:t>Con titular APRO el pedido pasa a PAGADO; con OTHE o FUND queda en PENDIENTE_PAGO y el cliente ve el rechazo; al recargar, nada se duplica.</w:t>
+      </w:r>
+    </w:p>
+    <w:p>
+      <w:pPr>
+        <w:spacing w:after="60"/>
+      </w:pPr>
+      <w:r>
+        <w:rPr>
+          <w:b/>
+          <w:color w:val="0B5CAD"/>
+        </w:rPr>
+        <w:t xml:space="preserve">Qué debe poder explicar: </w:t>
+      </w:r>
+      <w:r>
+        <w:t>El límite del diseño: si el cliente paga y cierra el navegador antes de volver, el pedido queda en PENDIENTE_PAGO.</w:t>
+      </w:r>
+    </w:p>
+    <w:p>
+      <w:pPr>
+        <w:spacing w:after="200"/>
+        <w:ind w:left="170"/>
+        <w:shd w:val="clear" w:color="auto" w:fill="E8F5EC"/>
+        <w:pBdr>
+          <w:left w:val="single" w:sz="18" w:space="6" w:color="1A7F37"/>
+        </w:pBdr>
+      </w:pPr>
+      <w:r>
+        <w:rPr>
+          <w:b/>
+          <w:color w:val="1A7F37"/>
+        </w:rPr>
+        <w:t xml:space="preserve">Cumple si: </w:t>
+      </w:r>
+      <w:r>
+        <w:t>Consulta el pago desde el servidor, distingue aprobado y rechazado y no duplica.</w:t>
       </w:r>
     </w:p>
     <w:p>
@@ -1903,7 +2707,7 @@
         <w:t xml:space="preserve">Objetivo: </w:t>
       </w:r>
       <w:r>
-        <w:t>Comprobar que cada integrante entiende el proyecto completo, no solo la parte que hizo. En un equipo real, cualquiera debe poder atender una caída a las 3 a. m.</w:t>
+        <w:t xml:space="preserve">Comprobar que cada integrante entiende el proyecto completo, no solo la parte que hizo. En un equipo real, cualquiera debe poder atender una caída a las 3 a. m. Además, cada integrante defiende un caso sorteado de «Del examen a la práctica»: muestra la evidencia de su cuenta (con el nombre de la pila y la hora), explica qué pasó y por qué, y qué propone para mejorar.</w:t>
       </w:r>
     </w:p>
     <w:p>
@@ -2120,7 +2924,7 @@
           <w:i w:val="0"/>
           <w:color w:val="B42318"/>
         </w:rPr>
-        <w:t>El alumno que no sustenta (no se presenta a la sustentación o no logra sustentar su pregunta) tiene nota 0 en este trabajo, aunque haya participado en la implementación.</w:t>
+        <w:t>El alumno que no sustenta (no se presenta a la sustentación o no logra sustentar su pregunta) tiene nota 0 en este trabajo, aunque haya participado en la implementación y en el video.</w:t>
       </w:r>
     </w:p>
     <w:p>
@@ -5500,7 +6304,7 @@
           <w:b w:val="0"/>
           <w:i w:val="0"/>
         </w:rPr>
-        <w:t>Los números solos no alcanzan. El grupo explica en la presentación, apoyándose en las gráficas:</w:t>
+        <w:t>Los números solos no alcanzan. El grupo explica, en el video y en la presentación, apoyándose en las gráficas:</w:t>
       </w:r>
     </w:p>
     <w:p>
@@ -5584,7 +6388,7 @@
         <w:spacing w:after="40"/>
       </w:pPr>
       <w:r>
-        <w:t>No se hace en clase: el grupo trae los resultados de las dos pruebas.</w:t>
+        <w:t>No se hace en clase: el grupo trae los resultados de las dos pruebas y la ejecución se ve en el video.</w:t>
       </w:r>
     </w:p>
     <w:p>
@@ -6964,6 +7768,57 @@
         <w:t>Grupo: ______________________________   Fecha: ____________   Repositorio: ____________________________________</w:t>
       </w:r>
     </w:p>
+    <w:p>
+      <w:pPr>
+        <w:spacing w:after="120"/>
+      </w:pPr>
+      <w:r>
+        <w:rPr>
+          <w:b w:val="0"/>
+          <w:i w:val="0"/>
+        </w:rPr>
+        <w:t>Integrantes: _____________________________________________________________________________________</w:t>
+      </w:r>
+    </w:p>
+    <w:p>
+      <w:pPr>
+        <w:spacing w:after="160"/>
+      </w:pPr>
+      <w:r>
+        <w:rPr>
+          <w:b w:val="0"/>
+          <w:i w:val="0"/>
+        </w:rPr>
+        <w:t>Requisitos:   ☐ Grupo de 7 a 10 integrantes   ☐ Video completo entregado hasta el 23/10/2026 con todos los integrantes   ☐ Tienda desplegada</w:t>
+      </w:r>
+    </w:p>
+    <w:p>
+      <w:pPr>
+        <w:spacing w:after="120"/>
+      </w:pPr>
+      <w:r>
+        <w:rPr>
+          <w:b w:val="0"/>
+          <w:i w:val="0"/>
+          <w:color w:val="55595E"/>
+        </w:rPr>
+        <w:t>Marcar cada indicador. Un bloque vale 5 solo si todos sus indicadores están marcados como «Cumple»; si no, vale 0.</w:t>
+      </w:r>
+    </w:p>
+    <w:p>
+      <w:pPr>
+        <w:keepNext/>
+        <w:spacing w:after="40"/>
+      </w:pPr>
+      <w:r>
+        <w:rPr>
+          <w:b/>
+          <w:i w:val="0"/>
+          <w:color w:val="0B5CAD"/>
+        </w:rPr>
+        <w:t>Bloque 1: Despliegue, AWS SDK y fallas</w:t>
+      </w:r>
+    </w:p>
     <w:tbl>
       <w:tblPr>
         <w:tblStyle w:val="TableGrid"/>
@@ -6972,14 +7827,35 @@
         <w:tblLook w:firstColumn="1" w:firstRow="1" w:lastColumn="0" w:lastRow="0" w:noHBand="0" w:noVBand="1" w:val="04A0"/>
       </w:tblPr>
       <w:tblGrid>
-        <w:gridCol w:w="3213"/>
-        <w:gridCol w:w="3213"/>
-        <w:gridCol w:w="3213"/>
+        <w:gridCol w:w="2409"/>
+        <w:gridCol w:w="2409"/>
+        <w:gridCol w:w="2409"/>
+        <w:gridCol w:w="2409"/>
       </w:tblGrid>
       <w:tr>
         <w:tc>
           <w:tcPr>
-            <w:tcW w:type="dxa" w:w="2608"/>
+            <w:tcW w:type="dxa" w:w="567"/>
+            <w:shd w:val="clear" w:color="auto" w:fill="0B5CAD"/>
+          </w:tcPr>
+          <w:p>
+            <w:pPr>
+              <w:jc w:val="center"/>
+            </w:pPr>
+            <w:r/>
+            <w:r>
+              <w:rPr>
+                <w:b/>
+                <w:color w:val="FFFFFF"/>
+                <w:sz w:val="19"/>
+              </w:rPr>
+              <w:t>#</w:t>
+            </w:r>
+          </w:p>
+        </w:tc>
+        <w:tc>
+          <w:tcPr>
+            <w:tcW w:type="dxa" w:w="6236"/>
             <w:shd w:val="clear" w:color="auto" w:fill="0B5CAD"/>
           </w:tcPr>
           <w:p>
@@ -6990,24 +7866,7 @@
                 <w:color w:val="FFFFFF"/>
                 <w:sz w:val="19"/>
               </w:rPr>
-              <w:t>Categoría</w:t>
-            </w:r>
-          </w:p>
-        </w:tc>
-        <w:tc>
-          <w:tcPr>
-            <w:tcW w:type="dxa" w:w="5669"/>
-            <w:shd w:val="clear" w:color="auto" w:fill="0B5CAD"/>
-          </w:tcPr>
-          <w:p>
-            <w:r/>
-            <w:r>
-              <w:rPr>
-                <w:b/>
-                <w:color w:val="FFFFFF"/>
-                <w:sz w:val="19"/>
-              </w:rPr>
-              <w:t>Pasos</w:t>
+              <w:t>Indicador</w:t>
             </w:r>
           </w:p>
         </w:tc>
@@ -7027,7 +7886,27 @@
                 <w:color w:val="FFFFFF"/>
                 <w:sz w:val="19"/>
               </w:rPr>
-              <w:t>Puntaje</w:t>
+              <w:t>Cumple</w:t>
+            </w:r>
+          </w:p>
+        </w:tc>
+        <w:tc>
+          <w:tcPr>
+            <w:tcW w:type="dxa" w:w="1474"/>
+            <w:shd w:val="clear" w:color="auto" w:fill="0B5CAD"/>
+          </w:tcPr>
+          <w:p>
+            <w:pPr>
+              <w:jc w:val="center"/>
+            </w:pPr>
+            <w:r/>
+            <w:r>
+              <w:rPr>
+                <w:b/>
+                <w:color w:val="FFFFFF"/>
+                <w:sz w:val="19"/>
+              </w:rPr>
+              <w:t>No cumple</w:t>
             </w:r>
           </w:p>
         </w:tc>
@@ -7035,22 +7914,25 @@
       <w:tr>
         <w:tc>
           <w:tcPr>
-            <w:tcW w:type="dxa" w:w="2608"/>
+            <w:tcW w:type="dxa" w:w="567"/>
           </w:tcPr>
           <w:p>
+            <w:pPr>
+              <w:jc w:val="center"/>
+            </w:pPr>
             <w:r/>
             <w:r>
               <w:rPr>
                 <w:b/>
                 <w:sz w:val="19"/>
               </w:rPr>
-              <w:t>Bloque 1: Despliegue, AWS SDK y fallas</w:t>
+              <w:t>1a</w:t>
             </w:r>
           </w:p>
         </w:tc>
         <w:tc>
           <w:tcPr>
-            <w:tcW w:type="dxa" w:w="5669"/>
+            <w:tcW w:type="dxa" w:w="6236"/>
           </w:tcPr>
           <w:p>
             <w:r/>
@@ -7059,7 +7941,361 @@
                 <w:b w:val="0"/>
                 <w:sz w:val="19"/>
               </w:rPr>
-              <w:t>La tienda funciona por HTTPS con balanceo, búsqueda y compra, desplegada por el pipeline, y un cambio llega solo, con commit, ejecución y tienda coincidentes. Las métricas llegan desde AWS, la EC2 no tiene claves y el rol IAM está explicado; ninguna Access Key está escrita en código, configuración o servidor. Cuando cae un servidor, la tienda sigue, el carrito se mantiene y se ve el reemplazo automático. Cuando cae una zona, la zona A queda aislada, la tienda vende desde la zona B y se hace el failover de Redis. Se presentan las tres evidencias de la caída y la restauración.</w:t>
+              <w:t>Pipeline: primer despliegue y cambio automático</w:t>
+            </w:r>
+          </w:p>
+        </w:tc>
+        <w:tc>
+          <w:tcPr>
+            <w:tcW w:type="dxa" w:w="1361"/>
+          </w:tcPr>
+          <w:p>
+            <w:pPr>
+              <w:jc w:val="center"/>
+            </w:pPr>
+            <w:r/>
+            <w:r>
+              <w:rPr>
+                <w:b w:val="0"/>
+                <w:sz w:val="19"/>
+              </w:rPr>
+              <w:t>☐</w:t>
+            </w:r>
+          </w:p>
+        </w:tc>
+        <w:tc>
+          <w:tcPr>
+            <w:tcW w:type="dxa" w:w="1474"/>
+          </w:tcPr>
+          <w:p>
+            <w:pPr>
+              <w:jc w:val="center"/>
+            </w:pPr>
+            <w:r/>
+            <w:r>
+              <w:rPr>
+                <w:b w:val="0"/>
+                <w:sz w:val="19"/>
+              </w:rPr>
+              <w:t>☐</w:t>
+            </w:r>
+          </w:p>
+        </w:tc>
+      </w:tr>
+      <w:tr>
+        <w:tc>
+          <w:tcPr>
+            <w:tcW w:type="dxa" w:w="567"/>
+          </w:tcPr>
+          <w:p>
+            <w:pPr>
+              <w:jc w:val="center"/>
+            </w:pPr>
+            <w:r/>
+            <w:r>
+              <w:rPr>
+                <w:b/>
+                <w:sz w:val="19"/>
+              </w:rPr>
+              <w:t>1b</w:t>
+            </w:r>
+          </w:p>
+        </w:tc>
+        <w:tc>
+          <w:tcPr>
+            <w:tcW w:type="dxa" w:w="6236"/>
+          </w:tcPr>
+          <w:p>
+            <w:r/>
+            <w:r>
+              <w:rPr>
+                <w:b w:val="0"/>
+                <w:sz w:val="19"/>
+              </w:rPr>
+              <w:t>AWS SDK configurado y en uso, sin claves</w:t>
+            </w:r>
+          </w:p>
+        </w:tc>
+        <w:tc>
+          <w:tcPr>
+            <w:tcW w:type="dxa" w:w="1361"/>
+          </w:tcPr>
+          <w:p>
+            <w:pPr>
+              <w:jc w:val="center"/>
+            </w:pPr>
+            <w:r/>
+            <w:r>
+              <w:rPr>
+                <w:b w:val="0"/>
+                <w:sz w:val="19"/>
+              </w:rPr>
+              <w:t>☐</w:t>
+            </w:r>
+          </w:p>
+        </w:tc>
+        <w:tc>
+          <w:tcPr>
+            <w:tcW w:type="dxa" w:w="1474"/>
+          </w:tcPr>
+          <w:p>
+            <w:pPr>
+              <w:jc w:val="center"/>
+            </w:pPr>
+            <w:r/>
+            <w:r>
+              <w:rPr>
+                <w:b w:val="0"/>
+                <w:sz w:val="19"/>
+              </w:rPr>
+              <w:t>☐</w:t>
+            </w:r>
+          </w:p>
+        </w:tc>
+      </w:tr>
+      <w:tr>
+        <w:tc>
+          <w:tcPr>
+            <w:tcW w:type="dxa" w:w="567"/>
+          </w:tcPr>
+          <w:p>
+            <w:pPr>
+              <w:jc w:val="center"/>
+            </w:pPr>
+            <w:r/>
+            <w:r>
+              <w:rPr>
+                <w:b/>
+                <w:sz w:val="19"/>
+              </w:rPr>
+              <w:t>1c</w:t>
+            </w:r>
+          </w:p>
+        </w:tc>
+        <w:tc>
+          <w:tcPr>
+            <w:tcW w:type="dxa" w:w="6236"/>
+          </w:tcPr>
+          <w:p>
+            <w:r/>
+            <w:r>
+              <w:rPr>
+                <w:b w:val="0"/>
+                <w:sz w:val="19"/>
+              </w:rPr>
+              <w:t>Cae un servidor</w:t>
+            </w:r>
+          </w:p>
+        </w:tc>
+        <w:tc>
+          <w:tcPr>
+            <w:tcW w:type="dxa" w:w="1361"/>
+          </w:tcPr>
+          <w:p>
+            <w:pPr>
+              <w:jc w:val="center"/>
+            </w:pPr>
+            <w:r/>
+            <w:r>
+              <w:rPr>
+                <w:b w:val="0"/>
+                <w:sz w:val="19"/>
+              </w:rPr>
+              <w:t>☐</w:t>
+            </w:r>
+          </w:p>
+        </w:tc>
+        <w:tc>
+          <w:tcPr>
+            <w:tcW w:type="dxa" w:w="1474"/>
+          </w:tcPr>
+          <w:p>
+            <w:pPr>
+              <w:jc w:val="center"/>
+            </w:pPr>
+            <w:r/>
+            <w:r>
+              <w:rPr>
+                <w:b w:val="0"/>
+                <w:sz w:val="19"/>
+              </w:rPr>
+              <w:t>☐</w:t>
+            </w:r>
+          </w:p>
+        </w:tc>
+      </w:tr>
+      <w:tr>
+        <w:tc>
+          <w:tcPr>
+            <w:tcW w:type="dxa" w:w="567"/>
+          </w:tcPr>
+          <w:p>
+            <w:pPr>
+              <w:jc w:val="center"/>
+            </w:pPr>
+            <w:r/>
+            <w:r>
+              <w:rPr>
+                <w:b/>
+                <w:sz w:val="19"/>
+              </w:rPr>
+              <w:t>1d</w:t>
+            </w:r>
+          </w:p>
+        </w:tc>
+        <w:tc>
+          <w:tcPr>
+            <w:tcW w:type="dxa" w:w="6236"/>
+          </w:tcPr>
+          <w:p>
+            <w:r/>
+            <w:r>
+              <w:rPr>
+                <w:b w:val="0"/>
+                <w:sz w:val="19"/>
+              </w:rPr>
+              <w:t>Cae una zona completa</w:t>
+            </w:r>
+          </w:p>
+        </w:tc>
+        <w:tc>
+          <w:tcPr>
+            <w:tcW w:type="dxa" w:w="1361"/>
+          </w:tcPr>
+          <w:p>
+            <w:pPr>
+              <w:jc w:val="center"/>
+            </w:pPr>
+            <w:r/>
+            <w:r>
+              <w:rPr>
+                <w:b w:val="0"/>
+                <w:sz w:val="19"/>
+              </w:rPr>
+              <w:t>☐</w:t>
+            </w:r>
+          </w:p>
+        </w:tc>
+        <w:tc>
+          <w:tcPr>
+            <w:tcW w:type="dxa" w:w="1474"/>
+          </w:tcPr>
+          <w:p>
+            <w:pPr>
+              <w:jc w:val="center"/>
+            </w:pPr>
+            <w:r/>
+            <w:r>
+              <w:rPr>
+                <w:b w:val="0"/>
+                <w:sz w:val="19"/>
+              </w:rPr>
+              <w:t>☐</w:t>
+            </w:r>
+          </w:p>
+        </w:tc>
+      </w:tr>
+      <w:tr>
+        <w:tc>
+          <w:tcPr>
+            <w:tcW w:type="dxa" w:w="567"/>
+          </w:tcPr>
+          <w:p>
+            <w:pPr>
+              <w:jc w:val="center"/>
+            </w:pPr>
+            <w:r/>
+            <w:r>
+              <w:rPr>
+                <w:b/>
+                <w:sz w:val="19"/>
+              </w:rPr>
+              <w:t>1e</w:t>
+            </w:r>
+          </w:p>
+        </w:tc>
+        <w:tc>
+          <w:tcPr>
+            <w:tcW w:type="dxa" w:w="6236"/>
+          </w:tcPr>
+          <w:p>
+            <w:r/>
+            <w:r>
+              <w:rPr>
+                <w:b w:val="0"/>
+                <w:sz w:val="19"/>
+              </w:rPr>
+              <w:t>Evidencia de la caída y restauración</w:t>
+            </w:r>
+          </w:p>
+        </w:tc>
+        <w:tc>
+          <w:tcPr>
+            <w:tcW w:type="dxa" w:w="1361"/>
+          </w:tcPr>
+          <w:p>
+            <w:pPr>
+              <w:jc w:val="center"/>
+            </w:pPr>
+            <w:r/>
+            <w:r>
+              <w:rPr>
+                <w:b w:val="0"/>
+                <w:sz w:val="19"/>
+              </w:rPr>
+              <w:t>☐</w:t>
+            </w:r>
+          </w:p>
+        </w:tc>
+        <w:tc>
+          <w:tcPr>
+            <w:tcW w:type="dxa" w:w="1474"/>
+          </w:tcPr>
+          <w:p>
+            <w:pPr>
+              <w:jc w:val="center"/>
+            </w:pPr>
+            <w:r/>
+            <w:r>
+              <w:rPr>
+                <w:b w:val="0"/>
+                <w:sz w:val="19"/>
+              </w:rPr>
+              <w:t>☐</w:t>
+            </w:r>
+          </w:p>
+        </w:tc>
+      </w:tr>
+      <w:tr>
+        <w:tc>
+          <w:tcPr>
+            <w:tcW w:type="dxa" w:w="567"/>
+          </w:tcPr>
+          <w:p>
+            <w:pPr>
+              <w:jc w:val="center"/>
+            </w:pPr>
+            <w:r/>
+            <w:r>
+              <w:rPr>
+                <w:b/>
+                <w:sz w:val="19"/>
+              </w:rPr>
+            </w:r>
+          </w:p>
+        </w:tc>
+        <w:tc>
+          <w:tcPr>
+            <w:tcW w:type="dxa" w:w="6236"/>
+          </w:tcPr>
+          <w:p>
+            <w:r/>
+            <w:r>
+              <w:rPr>
+                <w:b w:val="0"/>
+                <w:sz w:val="19"/>
+              </w:rPr>
+              <w:t>Puntaje del bloque (5 o 0)</w:t>
             </w:r>
           </w:p>
         </w:tc>
@@ -7080,26 +8316,159 @@
             </w:r>
           </w:p>
         </w:tc>
+        <w:tc>
+          <w:tcPr>
+            <w:tcW w:type="dxa" w:w="1474"/>
+          </w:tcPr>
+          <w:p>
+            <w:pPr>
+              <w:jc w:val="center"/>
+            </w:pPr>
+            <w:r/>
+            <w:r>
+              <w:rPr>
+                <w:b w:val="0"/>
+                <w:sz w:val="19"/>
+              </w:rPr>
+              <w:t>____</w:t>
+            </w:r>
+          </w:p>
+        </w:tc>
       </w:tr>
+    </w:tbl>
+    <w:p>
+      <w:pPr>
+        <w:spacing w:after="120"/>
+      </w:pPr>
+    </w:p>
+    <w:p>
+      <w:pPr>
+        <w:keepNext/>
+        <w:spacing w:after="40"/>
+      </w:pPr>
+      <w:r>
+        <w:rPr>
+          <w:b/>
+          <w:i w:val="0"/>
+          <w:color w:val="0B5CAD"/>
+        </w:rPr>
+        <w:t>Bloque 2: PostgreSQL: carga y búsqueda por vectores</w:t>
+      </w:r>
+    </w:p>
+    <w:tbl>
+      <w:tblPr>
+        <w:tblStyle w:val="TableGrid"/>
+        <w:tblW w:type="auto" w:w="0"/>
+        <w:jc w:val="center"/>
+        <w:tblLook w:firstColumn="1" w:firstRow="1" w:lastColumn="0" w:lastRow="0" w:noHBand="0" w:noVBand="1" w:val="04A0"/>
+      </w:tblPr>
+      <w:tblGrid>
+        <w:gridCol w:w="2409"/>
+        <w:gridCol w:w="2409"/>
+        <w:gridCol w:w="2409"/>
+        <w:gridCol w:w="2409"/>
+      </w:tblGrid>
       <w:tr>
         <w:tc>
           <w:tcPr>
-            <w:tcW w:type="dxa" w:w="2608"/>
+            <w:tcW w:type="dxa" w:w="567"/>
+            <w:shd w:val="clear" w:color="auto" w:fill="0B5CAD"/>
+          </w:tcPr>
+          <w:p>
+            <w:pPr>
+              <w:jc w:val="center"/>
+            </w:pPr>
+            <w:r/>
+            <w:r>
+              <w:rPr>
+                <w:b/>
+                <w:color w:val="FFFFFF"/>
+                <w:sz w:val="19"/>
+              </w:rPr>
+              <w:t>#</w:t>
+            </w:r>
+          </w:p>
+        </w:tc>
+        <w:tc>
+          <w:tcPr>
+            <w:tcW w:type="dxa" w:w="6236"/>
+            <w:shd w:val="clear" w:color="auto" w:fill="0B5CAD"/>
           </w:tcPr>
           <w:p>
             <w:r/>
             <w:r>
               <w:rPr>
                 <w:b/>
+                <w:color w:val="FFFFFF"/>
                 <w:sz w:val="19"/>
               </w:rPr>
-              <w:t>Bloque 2: PostgreSQL: carga y búsqueda por vectores</w:t>
+              <w:t>Indicador</w:t>
             </w:r>
           </w:p>
         </w:tc>
         <w:tc>
           <w:tcPr>
-            <w:tcW w:type="dxa" w:w="5669"/>
+            <w:tcW w:type="dxa" w:w="1361"/>
+            <w:shd w:val="clear" w:color="auto" w:fill="0B5CAD"/>
+          </w:tcPr>
+          <w:p>
+            <w:pPr>
+              <w:jc w:val="center"/>
+            </w:pPr>
+            <w:r/>
+            <w:r>
+              <w:rPr>
+                <w:b/>
+                <w:color w:val="FFFFFF"/>
+                <w:sz w:val="19"/>
+              </w:rPr>
+              <w:t>Cumple</w:t>
+            </w:r>
+          </w:p>
+        </w:tc>
+        <w:tc>
+          <w:tcPr>
+            <w:tcW w:type="dxa" w:w="1474"/>
+            <w:shd w:val="clear" w:color="auto" w:fill="0B5CAD"/>
+          </w:tcPr>
+          <w:p>
+            <w:pPr>
+              <w:jc w:val="center"/>
+            </w:pPr>
+            <w:r/>
+            <w:r>
+              <w:rPr>
+                <w:b/>
+                <w:color w:val="FFFFFF"/>
+                <w:sz w:val="19"/>
+              </w:rPr>
+              <w:t>No cumple</w:t>
+            </w:r>
+          </w:p>
+        </w:tc>
+      </w:tr>
+      <w:tr>
+        <w:tc>
+          <w:tcPr>
+            <w:tcW w:type="dxa" w:w="567"/>
+          </w:tcPr>
+          <w:p>
+            <w:pPr>
+              <w:jc w:val="center"/>
+            </w:pPr>
+            <w:r/>
+            <w:r>
+              <w:rPr>
+                <w:b/>
+                <w:sz w:val="19"/>
+              </w:rPr>
+              <w:t>2a</w:t>
+            </w:r>
+          </w:p>
+        </w:tc>
+        <w:tc>
+          <w:tcPr>
+            <w:tcW w:type="dxa" w:w="6236"/>
           </w:tcPr>
           <w:p>
             <w:r/>
@@ -7108,7 +8477,361 @@
                 <w:b w:val="0"/>
                 <w:sz w:val="19"/>
               </w:rPr>
-              <w:t>PgBouncer está en ambas EC2, desplegado por el pipeline, con la app usándolo y las migraciones directas. El script de carga está en el repositorio, con dos pruebas comparables, sin y con PgBouncer. La comparación está completa, con las métricas de PgBouncer publicadas, la alarma disparada y la interpretación sustentada con los datos. Hay al menos 30 productos nuevos desplegados por el pipeline, todos con vector, y la consulta de similitud ejecutada y explicada. La tabla de búsquedas está completa con los dos umbrales, el cambio se hizo por el pipeline y la interpretación está sustentada.</w:t>
+              <w:t>PgBouncer instalado por el pipeline</w:t>
+            </w:r>
+          </w:p>
+        </w:tc>
+        <w:tc>
+          <w:tcPr>
+            <w:tcW w:type="dxa" w:w="1361"/>
+          </w:tcPr>
+          <w:p>
+            <w:pPr>
+              <w:jc w:val="center"/>
+            </w:pPr>
+            <w:r/>
+            <w:r>
+              <w:rPr>
+                <w:b w:val="0"/>
+                <w:sz w:val="19"/>
+              </w:rPr>
+              <w:t>☐</w:t>
+            </w:r>
+          </w:p>
+        </w:tc>
+        <w:tc>
+          <w:tcPr>
+            <w:tcW w:type="dxa" w:w="1474"/>
+          </w:tcPr>
+          <w:p>
+            <w:pPr>
+              <w:jc w:val="center"/>
+            </w:pPr>
+            <w:r/>
+            <w:r>
+              <w:rPr>
+                <w:b w:val="0"/>
+                <w:sz w:val="19"/>
+              </w:rPr>
+              <w:t>☐</w:t>
+            </w:r>
+          </w:p>
+        </w:tc>
+      </w:tr>
+      <w:tr>
+        <w:tc>
+          <w:tcPr>
+            <w:tcW w:type="dxa" w:w="567"/>
+          </w:tcPr>
+          <w:p>
+            <w:pPr>
+              <w:jc w:val="center"/>
+            </w:pPr>
+            <w:r/>
+            <w:r>
+              <w:rPr>
+                <w:b/>
+                <w:sz w:val="19"/>
+              </w:rPr>
+              <w:t>2b</w:t>
+            </w:r>
+          </w:p>
+        </w:tc>
+        <w:tc>
+          <w:tcPr>
+            <w:tcW w:type="dxa" w:w="6236"/>
+          </w:tcPr>
+          <w:p>
+            <w:r/>
+            <w:r>
+              <w:rPr>
+                <w:b w:val="0"/>
+                <w:sz w:val="19"/>
+              </w:rPr>
+              <w:t>Prueba de carga con k6</w:t>
+            </w:r>
+          </w:p>
+        </w:tc>
+        <w:tc>
+          <w:tcPr>
+            <w:tcW w:type="dxa" w:w="1361"/>
+          </w:tcPr>
+          <w:p>
+            <w:pPr>
+              <w:jc w:val="center"/>
+            </w:pPr>
+            <w:r/>
+            <w:r>
+              <w:rPr>
+                <w:b w:val="0"/>
+                <w:sz w:val="19"/>
+              </w:rPr>
+              <w:t>☐</w:t>
+            </w:r>
+          </w:p>
+        </w:tc>
+        <w:tc>
+          <w:tcPr>
+            <w:tcW w:type="dxa" w:w="1474"/>
+          </w:tcPr>
+          <w:p>
+            <w:pPr>
+              <w:jc w:val="center"/>
+            </w:pPr>
+            <w:r/>
+            <w:r>
+              <w:rPr>
+                <w:b w:val="0"/>
+                <w:sz w:val="19"/>
+              </w:rPr>
+              <w:t>☐</w:t>
+            </w:r>
+          </w:p>
+        </w:tc>
+      </w:tr>
+      <w:tr>
+        <w:tc>
+          <w:tcPr>
+            <w:tcW w:type="dxa" w:w="567"/>
+          </w:tcPr>
+          <w:p>
+            <w:pPr>
+              <w:jc w:val="center"/>
+            </w:pPr>
+            <w:r/>
+            <w:r>
+              <w:rPr>
+                <w:b/>
+                <w:sz w:val="19"/>
+              </w:rPr>
+              <w:t>2c</w:t>
+            </w:r>
+          </w:p>
+        </w:tc>
+        <w:tc>
+          <w:tcPr>
+            <w:tcW w:type="dxa" w:w="6236"/>
+          </w:tcPr>
+          <w:p>
+            <w:r/>
+            <w:r>
+              <w:rPr>
+                <w:b w:val="0"/>
+                <w:sz w:val="19"/>
+              </w:rPr>
+              <w:t>Evidencia en CloudWatch e interpretación</w:t>
+            </w:r>
+          </w:p>
+        </w:tc>
+        <w:tc>
+          <w:tcPr>
+            <w:tcW w:type="dxa" w:w="1361"/>
+          </w:tcPr>
+          <w:p>
+            <w:pPr>
+              <w:jc w:val="center"/>
+            </w:pPr>
+            <w:r/>
+            <w:r>
+              <w:rPr>
+                <w:b w:val="0"/>
+                <w:sz w:val="19"/>
+              </w:rPr>
+              <w:t>☐</w:t>
+            </w:r>
+          </w:p>
+        </w:tc>
+        <w:tc>
+          <w:tcPr>
+            <w:tcW w:type="dxa" w:w="1474"/>
+          </w:tcPr>
+          <w:p>
+            <w:pPr>
+              <w:jc w:val="center"/>
+            </w:pPr>
+            <w:r/>
+            <w:r>
+              <w:rPr>
+                <w:b w:val="0"/>
+                <w:sz w:val="19"/>
+              </w:rPr>
+              <w:t>☐</w:t>
+            </w:r>
+          </w:p>
+        </w:tc>
+      </w:tr>
+      <w:tr>
+        <w:tc>
+          <w:tcPr>
+            <w:tcW w:type="dxa" w:w="567"/>
+          </w:tcPr>
+          <w:p>
+            <w:pPr>
+              <w:jc w:val="center"/>
+            </w:pPr>
+            <w:r/>
+            <w:r>
+              <w:rPr>
+                <w:b/>
+                <w:sz w:val="19"/>
+              </w:rPr>
+              <w:t>2d</w:t>
+            </w:r>
+          </w:p>
+        </w:tc>
+        <w:tc>
+          <w:tcPr>
+            <w:tcW w:type="dxa" w:w="6236"/>
+          </w:tcPr>
+          <w:p>
+            <w:r/>
+            <w:r>
+              <w:rPr>
+                <w:b w:val="0"/>
+                <w:sz w:val="19"/>
+              </w:rPr>
+              <w:t>Más productos por migración y vectores verificados en RDS</w:t>
+            </w:r>
+          </w:p>
+        </w:tc>
+        <w:tc>
+          <w:tcPr>
+            <w:tcW w:type="dxa" w:w="1361"/>
+          </w:tcPr>
+          <w:p>
+            <w:pPr>
+              <w:jc w:val="center"/>
+            </w:pPr>
+            <w:r/>
+            <w:r>
+              <w:rPr>
+                <w:b w:val="0"/>
+                <w:sz w:val="19"/>
+              </w:rPr>
+              <w:t>☐</w:t>
+            </w:r>
+          </w:p>
+        </w:tc>
+        <w:tc>
+          <w:tcPr>
+            <w:tcW w:type="dxa" w:w="1474"/>
+          </w:tcPr>
+          <w:p>
+            <w:pPr>
+              <w:jc w:val="center"/>
+            </w:pPr>
+            <w:r/>
+            <w:r>
+              <w:rPr>
+                <w:b w:val="0"/>
+                <w:sz w:val="19"/>
+              </w:rPr>
+              <w:t>☐</w:t>
+            </w:r>
+          </w:p>
+        </w:tc>
+      </w:tr>
+      <w:tr>
+        <w:tc>
+          <w:tcPr>
+            <w:tcW w:type="dxa" w:w="567"/>
+          </w:tcPr>
+          <w:p>
+            <w:pPr>
+              <w:jc w:val="center"/>
+            </w:pPr>
+            <w:r/>
+            <w:r>
+              <w:rPr>
+                <w:b/>
+                <w:sz w:val="19"/>
+              </w:rPr>
+              <w:t>2e</w:t>
+            </w:r>
+          </w:p>
+        </w:tc>
+        <w:tc>
+          <w:tcPr>
+            <w:tcW w:type="dxa" w:w="6236"/>
+          </w:tcPr>
+          <w:p>
+            <w:r/>
+            <w:r>
+              <w:rPr>
+                <w:b w:val="0"/>
+                <w:sz w:val="19"/>
+              </w:rPr>
+              <w:t>Experimento de búsqueda e interpretación</w:t>
+            </w:r>
+          </w:p>
+        </w:tc>
+        <w:tc>
+          <w:tcPr>
+            <w:tcW w:type="dxa" w:w="1361"/>
+          </w:tcPr>
+          <w:p>
+            <w:pPr>
+              <w:jc w:val="center"/>
+            </w:pPr>
+            <w:r/>
+            <w:r>
+              <w:rPr>
+                <w:b w:val="0"/>
+                <w:sz w:val="19"/>
+              </w:rPr>
+              <w:t>☐</w:t>
+            </w:r>
+          </w:p>
+        </w:tc>
+        <w:tc>
+          <w:tcPr>
+            <w:tcW w:type="dxa" w:w="1474"/>
+          </w:tcPr>
+          <w:p>
+            <w:pPr>
+              <w:jc w:val="center"/>
+            </w:pPr>
+            <w:r/>
+            <w:r>
+              <w:rPr>
+                <w:b w:val="0"/>
+                <w:sz w:val="19"/>
+              </w:rPr>
+              <w:t>☐</w:t>
+            </w:r>
+          </w:p>
+        </w:tc>
+      </w:tr>
+      <w:tr>
+        <w:tc>
+          <w:tcPr>
+            <w:tcW w:type="dxa" w:w="567"/>
+          </w:tcPr>
+          <w:p>
+            <w:pPr>
+              <w:jc w:val="center"/>
+            </w:pPr>
+            <w:r/>
+            <w:r>
+              <w:rPr>
+                <w:b/>
+                <w:sz w:val="19"/>
+              </w:rPr>
+            </w:r>
+          </w:p>
+        </w:tc>
+        <w:tc>
+          <w:tcPr>
+            <w:tcW w:type="dxa" w:w="6236"/>
+          </w:tcPr>
+          <w:p>
+            <w:r/>
+            <w:r>
+              <w:rPr>
+                <w:b w:val="0"/>
+                <w:sz w:val="19"/>
+              </w:rPr>
+              <w:t>Puntaje del bloque (5 o 0)</w:t>
             </w:r>
           </w:p>
         </w:tc>
@@ -7129,26 +8852,159 @@
             </w:r>
           </w:p>
         </w:tc>
+        <w:tc>
+          <w:tcPr>
+            <w:tcW w:type="dxa" w:w="1474"/>
+          </w:tcPr>
+          <w:p>
+            <w:pPr>
+              <w:jc w:val="center"/>
+            </w:pPr>
+            <w:r/>
+            <w:r>
+              <w:rPr>
+                <w:b w:val="0"/>
+                <w:sz w:val="19"/>
+              </w:rPr>
+              <w:t>____</w:t>
+            </w:r>
+          </w:p>
+        </w:tc>
       </w:tr>
+    </w:tbl>
+    <w:p>
+      <w:pPr>
+        <w:spacing w:after="120"/>
+      </w:pPr>
+    </w:p>
+    <w:p>
+      <w:pPr>
+        <w:keepNext/>
+        <w:spacing w:after="40"/>
+      </w:pPr>
+      <w:r>
+        <w:rPr>
+          <w:b/>
+          <w:i w:val="0"/>
+          <w:color w:val="0B5CAD"/>
+        </w:rPr>
+        <w:t>Bloque 3: Carrito y pago</w:t>
+      </w:r>
+    </w:p>
+    <w:tbl>
+      <w:tblPr>
+        <w:tblStyle w:val="TableGrid"/>
+        <w:tblW w:type="auto" w:w="0"/>
+        <w:jc w:val="center"/>
+        <w:tblLook w:firstColumn="1" w:firstRow="1" w:lastColumn="0" w:lastRow="0" w:noHBand="0" w:noVBand="1" w:val="04A0"/>
+      </w:tblPr>
+      <w:tblGrid>
+        <w:gridCol w:w="2409"/>
+        <w:gridCol w:w="2409"/>
+        <w:gridCol w:w="2409"/>
+        <w:gridCol w:w="2409"/>
+      </w:tblGrid>
       <w:tr>
         <w:tc>
           <w:tcPr>
-            <w:tcW w:type="dxa" w:w="2608"/>
+            <w:tcW w:type="dxa" w:w="567"/>
+            <w:shd w:val="clear" w:color="auto" w:fill="0B5CAD"/>
+          </w:tcPr>
+          <w:p>
+            <w:pPr>
+              <w:jc w:val="center"/>
+            </w:pPr>
+            <w:r/>
+            <w:r>
+              <w:rPr>
+                <w:b/>
+                <w:color w:val="FFFFFF"/>
+                <w:sz w:val="19"/>
+              </w:rPr>
+              <w:t>#</w:t>
+            </w:r>
+          </w:p>
+        </w:tc>
+        <w:tc>
+          <w:tcPr>
+            <w:tcW w:type="dxa" w:w="6236"/>
+            <w:shd w:val="clear" w:color="auto" w:fill="0B5CAD"/>
           </w:tcPr>
           <w:p>
             <w:r/>
             <w:r>
               <w:rPr>
                 <w:b/>
+                <w:color w:val="FFFFFF"/>
                 <w:sz w:val="19"/>
               </w:rPr>
-              <w:t>Bloque 3: Carrito y pago</w:t>
+              <w:t>Indicador</w:t>
             </w:r>
           </w:p>
         </w:tc>
         <w:tc>
           <w:tcPr>
-            <w:tcW w:type="dxa" w:w="5669"/>
+            <w:tcW w:type="dxa" w:w="1361"/>
+            <w:shd w:val="clear" w:color="auto" w:fill="0B5CAD"/>
+          </w:tcPr>
+          <w:p>
+            <w:pPr>
+              <w:jc w:val="center"/>
+            </w:pPr>
+            <w:r/>
+            <w:r>
+              <w:rPr>
+                <w:b/>
+                <w:color w:val="FFFFFF"/>
+                <w:sz w:val="19"/>
+              </w:rPr>
+              <w:t>Cumple</w:t>
+            </w:r>
+          </w:p>
+        </w:tc>
+        <w:tc>
+          <w:tcPr>
+            <w:tcW w:type="dxa" w:w="1474"/>
+            <w:shd w:val="clear" w:color="auto" w:fill="0B5CAD"/>
+          </w:tcPr>
+          <w:p>
+            <w:pPr>
+              <w:jc w:val="center"/>
+            </w:pPr>
+            <w:r/>
+            <w:r>
+              <w:rPr>
+                <w:b/>
+                <w:color w:val="FFFFFF"/>
+                <w:sz w:val="19"/>
+              </w:rPr>
+              <w:t>No cumple</w:t>
+            </w:r>
+          </w:p>
+        </w:tc>
+      </w:tr>
+      <w:tr>
+        <w:tc>
+          <w:tcPr>
+            <w:tcW w:type="dxa" w:w="567"/>
+          </w:tcPr>
+          <w:p>
+            <w:pPr>
+              <w:jc w:val="center"/>
+            </w:pPr>
+            <w:r/>
+            <w:r>
+              <w:rPr>
+                <w:b/>
+                <w:sz w:val="19"/>
+              </w:rPr>
+              <w:t>3a</w:t>
+            </w:r>
+          </w:p>
+        </w:tc>
+        <w:tc>
+          <w:tcPr>
+            <w:tcW w:type="dxa" w:w="6236"/>
           </w:tcPr>
           <w:p>
             <w:r/>
@@ -7157,7 +9013,361 @@
                 <w:b w:val="0"/>
                 <w:sz w:val="19"/>
               </w:rPr>
-              <w:t>Las dos métricas del carrito tienen datos correctos (ActiveCarts cuenta personas, no clics). La gráfica y la alarma se crearon desde el YAML, y la simulación activa y recupera la alarma. El token de pago solo está en Secrets Manager, creado y autorizado desde el YAML. El ciclo de pago completo funciona, solo con elementos de prueba. La tienda consulta el pago desde el servidor, distingue aprobado y rechazado y no duplica.</w:t>
+              <w:t>Métricas del carrito con el AWS SDK</w:t>
+            </w:r>
+          </w:p>
+        </w:tc>
+        <w:tc>
+          <w:tcPr>
+            <w:tcW w:type="dxa" w:w="1361"/>
+          </w:tcPr>
+          <w:p>
+            <w:pPr>
+              <w:jc w:val="center"/>
+            </w:pPr>
+            <w:r/>
+            <w:r>
+              <w:rPr>
+                <w:b w:val="0"/>
+                <w:sz w:val="19"/>
+              </w:rPr>
+              <w:t>☐</w:t>
+            </w:r>
+          </w:p>
+        </w:tc>
+        <w:tc>
+          <w:tcPr>
+            <w:tcW w:type="dxa" w:w="1474"/>
+          </w:tcPr>
+          <w:p>
+            <w:pPr>
+              <w:jc w:val="center"/>
+            </w:pPr>
+            <w:r/>
+            <w:r>
+              <w:rPr>
+                <w:b w:val="0"/>
+                <w:sz w:val="19"/>
+              </w:rPr>
+              <w:t>☐</w:t>
+            </w:r>
+          </w:p>
+        </w:tc>
+      </w:tr>
+      <w:tr>
+        <w:tc>
+          <w:tcPr>
+            <w:tcW w:type="dxa" w:w="567"/>
+          </w:tcPr>
+          <w:p>
+            <w:pPr>
+              <w:jc w:val="center"/>
+            </w:pPr>
+            <w:r/>
+            <w:r>
+              <w:rPr>
+                <w:b/>
+                <w:sz w:val="19"/>
+              </w:rPr>
+              <w:t>3b</w:t>
+            </w:r>
+          </w:p>
+        </w:tc>
+        <w:tc>
+          <w:tcPr>
+            <w:tcW w:type="dxa" w:w="6236"/>
+          </w:tcPr>
+          <w:p>
+            <w:r/>
+            <w:r>
+              <w:rPr>
+                <w:b w:val="0"/>
+                <w:sz w:val="19"/>
+              </w:rPr>
+              <w:t>Gráfica, alarma y usuarios simulados</w:t>
+            </w:r>
+          </w:p>
+        </w:tc>
+        <w:tc>
+          <w:tcPr>
+            <w:tcW w:type="dxa" w:w="1361"/>
+          </w:tcPr>
+          <w:p>
+            <w:pPr>
+              <w:jc w:val="center"/>
+            </w:pPr>
+            <w:r/>
+            <w:r>
+              <w:rPr>
+                <w:b w:val="0"/>
+                <w:sz w:val="19"/>
+              </w:rPr>
+              <w:t>☐</w:t>
+            </w:r>
+          </w:p>
+        </w:tc>
+        <w:tc>
+          <w:tcPr>
+            <w:tcW w:type="dxa" w:w="1474"/>
+          </w:tcPr>
+          <w:p>
+            <w:pPr>
+              <w:jc w:val="center"/>
+            </w:pPr>
+            <w:r/>
+            <w:r>
+              <w:rPr>
+                <w:b w:val="0"/>
+                <w:sz w:val="19"/>
+              </w:rPr>
+              <w:t>☐</w:t>
+            </w:r>
+          </w:p>
+        </w:tc>
+      </w:tr>
+      <w:tr>
+        <w:tc>
+          <w:tcPr>
+            <w:tcW w:type="dxa" w:w="567"/>
+          </w:tcPr>
+          <w:p>
+            <w:pPr>
+              <w:jc w:val="center"/>
+            </w:pPr>
+            <w:r/>
+            <w:r>
+              <w:rPr>
+                <w:b/>
+                <w:sz w:val="19"/>
+              </w:rPr>
+              <w:t>3c</w:t>
+            </w:r>
+          </w:p>
+        </w:tc>
+        <w:tc>
+          <w:tcPr>
+            <w:tcW w:type="dxa" w:w="6236"/>
+          </w:tcPr>
+          <w:p>
+            <w:r/>
+            <w:r>
+              <w:rPr>
+                <w:b w:val="0"/>
+                <w:sz w:val="19"/>
+              </w:rPr>
+              <w:t>Credenciales de pago seguras</w:t>
+            </w:r>
+          </w:p>
+        </w:tc>
+        <w:tc>
+          <w:tcPr>
+            <w:tcW w:type="dxa" w:w="1361"/>
+          </w:tcPr>
+          <w:p>
+            <w:pPr>
+              <w:jc w:val="center"/>
+            </w:pPr>
+            <w:r/>
+            <w:r>
+              <w:rPr>
+                <w:b w:val="0"/>
+                <w:sz w:val="19"/>
+              </w:rPr>
+              <w:t>☐</w:t>
+            </w:r>
+          </w:p>
+        </w:tc>
+        <w:tc>
+          <w:tcPr>
+            <w:tcW w:type="dxa" w:w="1474"/>
+          </w:tcPr>
+          <w:p>
+            <w:pPr>
+              <w:jc w:val="center"/>
+            </w:pPr>
+            <w:r/>
+            <w:r>
+              <w:rPr>
+                <w:b w:val="0"/>
+                <w:sz w:val="19"/>
+              </w:rPr>
+              <w:t>☐</w:t>
+            </w:r>
+          </w:p>
+        </w:tc>
+      </w:tr>
+      <w:tr>
+        <w:tc>
+          <w:tcPr>
+            <w:tcW w:type="dxa" w:w="567"/>
+          </w:tcPr>
+          <w:p>
+            <w:pPr>
+              <w:jc w:val="center"/>
+            </w:pPr>
+            <w:r/>
+            <w:r>
+              <w:rPr>
+                <w:b/>
+                <w:sz w:val="19"/>
+              </w:rPr>
+              <w:t>3d</w:t>
+            </w:r>
+          </w:p>
+        </w:tc>
+        <w:tc>
+          <w:tcPr>
+            <w:tcW w:type="dxa" w:w="6236"/>
+          </w:tcPr>
+          <w:p>
+            <w:r/>
+            <w:r>
+              <w:rPr>
+                <w:b w:val="0"/>
+                <w:sz w:val="19"/>
+              </w:rPr>
+              <w:t>Pago con tarjeta de prueba</w:t>
+            </w:r>
+          </w:p>
+        </w:tc>
+        <w:tc>
+          <w:tcPr>
+            <w:tcW w:type="dxa" w:w="1361"/>
+          </w:tcPr>
+          <w:p>
+            <w:pPr>
+              <w:jc w:val="center"/>
+            </w:pPr>
+            <w:r/>
+            <w:r>
+              <w:rPr>
+                <w:b w:val="0"/>
+                <w:sz w:val="19"/>
+              </w:rPr>
+              <w:t>☐</w:t>
+            </w:r>
+          </w:p>
+        </w:tc>
+        <w:tc>
+          <w:tcPr>
+            <w:tcW w:type="dxa" w:w="1474"/>
+          </w:tcPr>
+          <w:p>
+            <w:pPr>
+              <w:jc w:val="center"/>
+            </w:pPr>
+            <w:r/>
+            <w:r>
+              <w:rPr>
+                <w:b w:val="0"/>
+                <w:sz w:val="19"/>
+              </w:rPr>
+              <w:t>☐</w:t>
+            </w:r>
+          </w:p>
+        </w:tc>
+      </w:tr>
+      <w:tr>
+        <w:tc>
+          <w:tcPr>
+            <w:tcW w:type="dxa" w:w="567"/>
+          </w:tcPr>
+          <w:p>
+            <w:pPr>
+              <w:jc w:val="center"/>
+            </w:pPr>
+            <w:r/>
+            <w:r>
+              <w:rPr>
+                <w:b/>
+                <w:sz w:val="19"/>
+              </w:rPr>
+              <w:t>3e</w:t>
+            </w:r>
+          </w:p>
+        </w:tc>
+        <w:tc>
+          <w:tcPr>
+            <w:tcW w:type="dxa" w:w="6236"/>
+          </w:tcPr>
+          <w:p>
+            <w:r/>
+            <w:r>
+              <w:rPr>
+                <w:b w:val="0"/>
+                <w:sz w:val="19"/>
+              </w:rPr>
+              <w:t>Confirmación segura al volver</w:t>
+            </w:r>
+          </w:p>
+        </w:tc>
+        <w:tc>
+          <w:tcPr>
+            <w:tcW w:type="dxa" w:w="1361"/>
+          </w:tcPr>
+          <w:p>
+            <w:pPr>
+              <w:jc w:val="center"/>
+            </w:pPr>
+            <w:r/>
+            <w:r>
+              <w:rPr>
+                <w:b w:val="0"/>
+                <w:sz w:val="19"/>
+              </w:rPr>
+              <w:t>☐</w:t>
+            </w:r>
+          </w:p>
+        </w:tc>
+        <w:tc>
+          <w:tcPr>
+            <w:tcW w:type="dxa" w:w="1474"/>
+          </w:tcPr>
+          <w:p>
+            <w:pPr>
+              <w:jc w:val="center"/>
+            </w:pPr>
+            <w:r/>
+            <w:r>
+              <w:rPr>
+                <w:b w:val="0"/>
+                <w:sz w:val="19"/>
+              </w:rPr>
+              <w:t>☐</w:t>
+            </w:r>
+          </w:p>
+        </w:tc>
+      </w:tr>
+      <w:tr>
+        <w:tc>
+          <w:tcPr>
+            <w:tcW w:type="dxa" w:w="567"/>
+          </w:tcPr>
+          <w:p>
+            <w:pPr>
+              <w:jc w:val="center"/>
+            </w:pPr>
+            <w:r/>
+            <w:r>
+              <w:rPr>
+                <w:b/>
+                <w:sz w:val="19"/>
+              </w:rPr>
+            </w:r>
+          </w:p>
+        </w:tc>
+        <w:tc>
+          <w:tcPr>
+            <w:tcW w:type="dxa" w:w="6236"/>
+          </w:tcPr>
+          <w:p>
+            <w:r/>
+            <w:r>
+              <w:rPr>
+                <w:b w:val="0"/>
+                <w:sz w:val="19"/>
+              </w:rPr>
+              <w:t>Puntaje del bloque (5 o 0)</w:t>
             </w:r>
           </w:p>
         </w:tc>
@@ -7178,41 +9388,9 @@
             </w:r>
           </w:p>
         </w:tc>
-      </w:tr>
-      <w:tr>
         <w:tc>
           <w:tcPr>
-            <w:tcW w:type="dxa" w:w="2608"/>
-          </w:tcPr>
-          <w:p>
-            <w:r/>
-            <w:r>
-              <w:rPr>
-                <w:b/>
-                <w:sz w:val="19"/>
-              </w:rPr>
-              <w:t>Bloque 4: Sustentación</w:t>
-            </w:r>
-          </w:p>
-        </w:tc>
-        <w:tc>
-          <w:tcPr>
-            <w:tcW w:type="dxa" w:w="5669"/>
-          </w:tcPr>
-          <w:p>
-            <w:r/>
-            <w:r>
-              <w:rPr>
-                <w:b w:val="0"/>
-                <w:sz w:val="19"/>
-              </w:rPr>
-              <w:t>Cada integrante responde una pregunta sorteada del banco. Si todos sustentan bien su pregunta, 5; si un solo integrante no logra sustentar, 0.</w:t>
-            </w:r>
-          </w:p>
-        </w:tc>
-        <w:tc>
-          <w:tcPr>
-            <w:tcW w:type="dxa" w:w="1361"/>
+            <w:tcW w:type="dxa" w:w="1474"/>
           </w:tcPr>
           <w:p>
             <w:pPr>
@@ -7224,6 +9402,92 @@
                 <w:b w:val="0"/>
                 <w:sz w:val="19"/>
               </w:rPr>
+              <w:t>____</w:t>
+            </w:r>
+          </w:p>
+        </w:tc>
+      </w:tr>
+    </w:tbl>
+    <w:p>
+      <w:pPr>
+        <w:spacing w:after="120"/>
+      </w:pPr>
+    </w:p>
+    <w:p>
+      <w:pPr>
+        <w:keepNext/>
+        <w:spacing w:after="40"/>
+      </w:pPr>
+      <w:r>
+        <w:rPr>
+          <w:b/>
+          <w:i w:val="0"/>
+          <w:color w:val="0B5CAD"/>
+        </w:rPr>
+        <w:t>Bloque 4: Sustentación</w:t>
+      </w:r>
+    </w:p>
+    <w:tbl>
+      <w:tblPr>
+        <w:tblStyle w:val="TableGrid"/>
+        <w:tblW w:type="auto" w:w="0"/>
+        <w:jc w:val="center"/>
+        <w:tblLook w:firstColumn="1" w:firstRow="1" w:lastColumn="0" w:lastRow="0" w:noHBand="0" w:noVBand="1" w:val="04A0"/>
+      </w:tblPr>
+      <w:tblGrid>
+        <w:gridCol w:w="3213"/>
+        <w:gridCol w:w="3213"/>
+        <w:gridCol w:w="3213"/>
+      </w:tblGrid>
+      <w:tr>
+        <w:tc>
+          <w:tcPr>
+            <w:tcW w:type="dxa" w:w="5102"/>
+            <w:shd w:val="clear" w:color="auto" w:fill="0B5CAD"/>
+          </w:tcPr>
+          <w:p>
+            <w:r/>
+            <w:r>
+              <w:rPr>
+                <w:b/>
+                <w:color w:val="FFFFFF"/>
+                <w:sz w:val="19"/>
+              </w:rPr>
+              <w:t>Integrante</w:t>
+            </w:r>
+          </w:p>
+        </w:tc>
+        <w:tc>
+          <w:tcPr>
+            <w:tcW w:type="dxa" w:w="1984"/>
+            <w:shd w:val="clear" w:color="auto" w:fill="0B5CAD"/>
+          </w:tcPr>
+          <w:p>
+            <w:r/>
+            <w:r>
+              <w:rPr>
+                <w:b/>
+                <w:color w:val="FFFFFF"/>
+                <w:sz w:val="19"/>
+              </w:rPr>
+              <w:t>N.º de pregunta</w:t>
+            </w:r>
+          </w:p>
+        </w:tc>
+        <w:tc>
+          <w:tcPr>
+            <w:tcW w:type="dxa" w:w="2551"/>
+            <w:shd w:val="clear" w:color="auto" w:fill="0B5CAD"/>
+          </w:tcPr>
+          <w:p>
+            <w:r/>
+            <w:r>
+              <w:rPr>
+                <w:b/>
+                <w:color w:val="FFFFFF"/>
+                <w:sz w:val="19"/>
+              </w:rPr>
+              <w:t>Sustenta</w:t>
             </w:r>
           </w:p>
         </w:tc>
@@ -7231,22 +9495,22 @@
       <w:tr>
         <w:tc>
           <w:tcPr>
-            <w:tcW w:type="dxa" w:w="2608"/>
+            <w:tcW w:type="dxa" w:w="5102"/>
           </w:tcPr>
           <w:p>
             <w:r/>
             <w:r>
               <w:rPr>
-                <w:b/>
+                <w:b w:val="0"/>
                 <w:sz w:val="19"/>
               </w:rPr>
-              <w:t>Nota final</w:t>
+              <w:t>1.</w:t>
             </w:r>
           </w:p>
         </w:tc>
         <w:tc>
           <w:tcPr>
-            <w:tcW w:type="dxa" w:w="5669"/>
+            <w:tcW w:type="dxa" w:w="1984"/>
           </w:tcPr>
           <w:p>
             <w:r/>
@@ -7260,7 +9524,555 @@
         </w:tc>
         <w:tc>
           <w:tcPr>
-            <w:tcW w:type="dxa" w:w="1361"/>
+            <w:tcW w:type="dxa" w:w="2551"/>
+          </w:tcPr>
+          <w:p>
+            <w:r/>
+            <w:r>
+              <w:rPr>
+                <w:b w:val="0"/>
+                <w:sz w:val="19"/>
+              </w:rPr>
+              <w:t>☐ Sí   ☐ No</w:t>
+            </w:r>
+          </w:p>
+        </w:tc>
+      </w:tr>
+      <w:tr>
+        <w:tc>
+          <w:tcPr>
+            <w:tcW w:type="dxa" w:w="5102"/>
+          </w:tcPr>
+          <w:p>
+            <w:r/>
+            <w:r>
+              <w:rPr>
+                <w:b w:val="0"/>
+                <w:sz w:val="19"/>
+              </w:rPr>
+              <w:t>2.</w:t>
+            </w:r>
+          </w:p>
+        </w:tc>
+        <w:tc>
+          <w:tcPr>
+            <w:tcW w:type="dxa" w:w="1984"/>
+          </w:tcPr>
+          <w:p>
+            <w:r/>
+            <w:r>
+              <w:rPr>
+                <w:b w:val="0"/>
+                <w:sz w:val="19"/>
+              </w:rPr>
+            </w:r>
+          </w:p>
+        </w:tc>
+        <w:tc>
+          <w:tcPr>
+            <w:tcW w:type="dxa" w:w="2551"/>
+          </w:tcPr>
+          <w:p>
+            <w:r/>
+            <w:r>
+              <w:rPr>
+                <w:b w:val="0"/>
+                <w:sz w:val="19"/>
+              </w:rPr>
+              <w:t>☐ Sí   ☐ No</w:t>
+            </w:r>
+          </w:p>
+        </w:tc>
+      </w:tr>
+      <w:tr>
+        <w:tc>
+          <w:tcPr>
+            <w:tcW w:type="dxa" w:w="5102"/>
+          </w:tcPr>
+          <w:p>
+            <w:r/>
+            <w:r>
+              <w:rPr>
+                <w:b w:val="0"/>
+                <w:sz w:val="19"/>
+              </w:rPr>
+              <w:t>3.</w:t>
+            </w:r>
+          </w:p>
+        </w:tc>
+        <w:tc>
+          <w:tcPr>
+            <w:tcW w:type="dxa" w:w="1984"/>
+          </w:tcPr>
+          <w:p>
+            <w:r/>
+            <w:r>
+              <w:rPr>
+                <w:b w:val="0"/>
+                <w:sz w:val="19"/>
+              </w:rPr>
+            </w:r>
+          </w:p>
+        </w:tc>
+        <w:tc>
+          <w:tcPr>
+            <w:tcW w:type="dxa" w:w="2551"/>
+          </w:tcPr>
+          <w:p>
+            <w:r/>
+            <w:r>
+              <w:rPr>
+                <w:b w:val="0"/>
+                <w:sz w:val="19"/>
+              </w:rPr>
+              <w:t>☐ Sí   ☐ No</w:t>
+            </w:r>
+          </w:p>
+        </w:tc>
+      </w:tr>
+      <w:tr>
+        <w:tc>
+          <w:tcPr>
+            <w:tcW w:type="dxa" w:w="5102"/>
+          </w:tcPr>
+          <w:p>
+            <w:r/>
+            <w:r>
+              <w:rPr>
+                <w:b w:val="0"/>
+                <w:sz w:val="19"/>
+              </w:rPr>
+              <w:t>4.</w:t>
+            </w:r>
+          </w:p>
+        </w:tc>
+        <w:tc>
+          <w:tcPr>
+            <w:tcW w:type="dxa" w:w="1984"/>
+          </w:tcPr>
+          <w:p>
+            <w:r/>
+            <w:r>
+              <w:rPr>
+                <w:b w:val="0"/>
+                <w:sz w:val="19"/>
+              </w:rPr>
+            </w:r>
+          </w:p>
+        </w:tc>
+        <w:tc>
+          <w:tcPr>
+            <w:tcW w:type="dxa" w:w="2551"/>
+          </w:tcPr>
+          <w:p>
+            <w:r/>
+            <w:r>
+              <w:rPr>
+                <w:b w:val="0"/>
+                <w:sz w:val="19"/>
+              </w:rPr>
+              <w:t>☐ Sí   ☐ No</w:t>
+            </w:r>
+          </w:p>
+        </w:tc>
+      </w:tr>
+      <w:tr>
+        <w:tc>
+          <w:tcPr>
+            <w:tcW w:type="dxa" w:w="5102"/>
+          </w:tcPr>
+          <w:p>
+            <w:r/>
+            <w:r>
+              <w:rPr>
+                <w:b w:val="0"/>
+                <w:sz w:val="19"/>
+              </w:rPr>
+              <w:t>5.</w:t>
+            </w:r>
+          </w:p>
+        </w:tc>
+        <w:tc>
+          <w:tcPr>
+            <w:tcW w:type="dxa" w:w="1984"/>
+          </w:tcPr>
+          <w:p>
+            <w:r/>
+            <w:r>
+              <w:rPr>
+                <w:b w:val="0"/>
+                <w:sz w:val="19"/>
+              </w:rPr>
+            </w:r>
+          </w:p>
+        </w:tc>
+        <w:tc>
+          <w:tcPr>
+            <w:tcW w:type="dxa" w:w="2551"/>
+          </w:tcPr>
+          <w:p>
+            <w:r/>
+            <w:r>
+              <w:rPr>
+                <w:b w:val="0"/>
+                <w:sz w:val="19"/>
+              </w:rPr>
+              <w:t>☐ Sí   ☐ No</w:t>
+            </w:r>
+          </w:p>
+        </w:tc>
+      </w:tr>
+      <w:tr>
+        <w:tc>
+          <w:tcPr>
+            <w:tcW w:type="dxa" w:w="5102"/>
+          </w:tcPr>
+          <w:p>
+            <w:r/>
+            <w:r>
+              <w:rPr>
+                <w:b w:val="0"/>
+                <w:sz w:val="19"/>
+              </w:rPr>
+              <w:t>6.</w:t>
+            </w:r>
+          </w:p>
+        </w:tc>
+        <w:tc>
+          <w:tcPr>
+            <w:tcW w:type="dxa" w:w="1984"/>
+          </w:tcPr>
+          <w:p>
+            <w:r/>
+            <w:r>
+              <w:rPr>
+                <w:b w:val="0"/>
+                <w:sz w:val="19"/>
+              </w:rPr>
+            </w:r>
+          </w:p>
+        </w:tc>
+        <w:tc>
+          <w:tcPr>
+            <w:tcW w:type="dxa" w:w="2551"/>
+          </w:tcPr>
+          <w:p>
+            <w:r/>
+            <w:r>
+              <w:rPr>
+                <w:b w:val="0"/>
+                <w:sz w:val="19"/>
+              </w:rPr>
+              <w:t>☐ Sí   ☐ No</w:t>
+            </w:r>
+          </w:p>
+        </w:tc>
+      </w:tr>
+      <w:tr>
+        <w:tc>
+          <w:tcPr>
+            <w:tcW w:type="dxa" w:w="5102"/>
+          </w:tcPr>
+          <w:p>
+            <w:r/>
+            <w:r>
+              <w:rPr>
+                <w:b w:val="0"/>
+                <w:sz w:val="19"/>
+              </w:rPr>
+              <w:t>7.</w:t>
+            </w:r>
+          </w:p>
+        </w:tc>
+        <w:tc>
+          <w:tcPr>
+            <w:tcW w:type="dxa" w:w="1984"/>
+          </w:tcPr>
+          <w:p>
+            <w:r/>
+            <w:r>
+              <w:rPr>
+                <w:b w:val="0"/>
+                <w:sz w:val="19"/>
+              </w:rPr>
+            </w:r>
+          </w:p>
+        </w:tc>
+        <w:tc>
+          <w:tcPr>
+            <w:tcW w:type="dxa" w:w="2551"/>
+          </w:tcPr>
+          <w:p>
+            <w:r/>
+            <w:r>
+              <w:rPr>
+                <w:b w:val="0"/>
+                <w:sz w:val="19"/>
+              </w:rPr>
+              <w:t>☐ Sí   ☐ No</w:t>
+            </w:r>
+          </w:p>
+        </w:tc>
+      </w:tr>
+      <w:tr>
+        <w:tc>
+          <w:tcPr>
+            <w:tcW w:type="dxa" w:w="5102"/>
+          </w:tcPr>
+          <w:p>
+            <w:r/>
+            <w:r>
+              <w:rPr>
+                <w:b w:val="0"/>
+                <w:sz w:val="19"/>
+              </w:rPr>
+              <w:t>8.</w:t>
+            </w:r>
+          </w:p>
+        </w:tc>
+        <w:tc>
+          <w:tcPr>
+            <w:tcW w:type="dxa" w:w="1984"/>
+          </w:tcPr>
+          <w:p>
+            <w:r/>
+            <w:r>
+              <w:rPr>
+                <w:b w:val="0"/>
+                <w:sz w:val="19"/>
+              </w:rPr>
+            </w:r>
+          </w:p>
+        </w:tc>
+        <w:tc>
+          <w:tcPr>
+            <w:tcW w:type="dxa" w:w="2551"/>
+          </w:tcPr>
+          <w:p>
+            <w:r/>
+            <w:r>
+              <w:rPr>
+                <w:b w:val="0"/>
+                <w:sz w:val="19"/>
+              </w:rPr>
+              <w:t>☐ Sí   ☐ No</w:t>
+            </w:r>
+          </w:p>
+        </w:tc>
+      </w:tr>
+      <w:tr>
+        <w:tc>
+          <w:tcPr>
+            <w:tcW w:type="dxa" w:w="5102"/>
+          </w:tcPr>
+          <w:p>
+            <w:r/>
+            <w:r>
+              <w:rPr>
+                <w:b w:val="0"/>
+                <w:sz w:val="19"/>
+              </w:rPr>
+              <w:t>9.</w:t>
+            </w:r>
+          </w:p>
+        </w:tc>
+        <w:tc>
+          <w:tcPr>
+            <w:tcW w:type="dxa" w:w="1984"/>
+          </w:tcPr>
+          <w:p>
+            <w:r/>
+            <w:r>
+              <w:rPr>
+                <w:b w:val="0"/>
+                <w:sz w:val="19"/>
+              </w:rPr>
+            </w:r>
+          </w:p>
+        </w:tc>
+        <w:tc>
+          <w:tcPr>
+            <w:tcW w:type="dxa" w:w="2551"/>
+          </w:tcPr>
+          <w:p>
+            <w:r/>
+            <w:r>
+              <w:rPr>
+                <w:b w:val="0"/>
+                <w:sz w:val="19"/>
+              </w:rPr>
+              <w:t>☐ Sí   ☐ No</w:t>
+            </w:r>
+          </w:p>
+        </w:tc>
+      </w:tr>
+      <w:tr>
+        <w:tc>
+          <w:tcPr>
+            <w:tcW w:type="dxa" w:w="5102"/>
+          </w:tcPr>
+          <w:p>
+            <w:r/>
+            <w:r>
+              <w:rPr>
+                <w:b w:val="0"/>
+                <w:sz w:val="19"/>
+              </w:rPr>
+              <w:t>10.</w:t>
+            </w:r>
+          </w:p>
+        </w:tc>
+        <w:tc>
+          <w:tcPr>
+            <w:tcW w:type="dxa" w:w="1984"/>
+          </w:tcPr>
+          <w:p>
+            <w:r/>
+            <w:r>
+              <w:rPr>
+                <w:b w:val="0"/>
+                <w:sz w:val="19"/>
+              </w:rPr>
+            </w:r>
+          </w:p>
+        </w:tc>
+        <w:tc>
+          <w:tcPr>
+            <w:tcW w:type="dxa" w:w="2551"/>
+          </w:tcPr>
+          <w:p>
+            <w:r/>
+            <w:r>
+              <w:rPr>
+                <w:b w:val="0"/>
+                <w:sz w:val="19"/>
+              </w:rPr>
+              <w:t>☐ Sí   ☐ No</w:t>
+            </w:r>
+          </w:p>
+        </w:tc>
+      </w:tr>
+      <w:tr>
+        <w:tc>
+          <w:tcPr>
+            <w:tcW w:type="dxa" w:w="5102"/>
+          </w:tcPr>
+          <w:p>
+            <w:r/>
+            <w:r>
+              <w:rPr>
+                <w:b w:val="0"/>
+                <w:sz w:val="19"/>
+              </w:rPr>
+              <w:t>Puntaje del bloque (5 si todos sustentan; 0 si uno no). Quien no sustenta: nota 0</w:t>
+            </w:r>
+          </w:p>
+        </w:tc>
+        <w:tc>
+          <w:tcPr>
+            <w:tcW w:type="dxa" w:w="1984"/>
+          </w:tcPr>
+          <w:p>
+            <w:r/>
+            <w:r>
+              <w:rPr>
+                <w:b w:val="0"/>
+                <w:sz w:val="19"/>
+              </w:rPr>
+            </w:r>
+          </w:p>
+        </w:tc>
+        <w:tc>
+          <w:tcPr>
+            <w:tcW w:type="dxa" w:w="2551"/>
+          </w:tcPr>
+          <w:p>
+            <w:r/>
+            <w:r>
+              <w:rPr>
+                <w:b w:val="0"/>
+                <w:sz w:val="19"/>
+              </w:rPr>
+              <w:t>____</w:t>
+            </w:r>
+          </w:p>
+        </w:tc>
+      </w:tr>
+    </w:tbl>
+    <w:p>
+      <w:pPr>
+        <w:spacing w:after="120"/>
+      </w:pPr>
+    </w:p>
+    <w:tbl>
+      <w:tblPr>
+        <w:tblStyle w:val="TableGrid"/>
+        <w:tblW w:type="auto" w:w="0"/>
+        <w:jc w:val="center"/>
+        <w:tblLook w:firstColumn="1" w:firstRow="1" w:lastColumn="0" w:lastRow="0" w:noHBand="0" w:noVBand="1" w:val="04A0"/>
+      </w:tblPr>
+      <w:tblGrid>
+        <w:gridCol w:w="4819"/>
+        <w:gridCol w:w="4819"/>
+      </w:tblGrid>
+      <w:tr>
+        <w:tc>
+          <w:tcPr>
+            <w:tcW w:type="dxa" w:w="6803"/>
+            <w:shd w:val="clear" w:color="auto" w:fill="0B5CAD"/>
+          </w:tcPr>
+          <w:p>
+            <w:r/>
+            <w:r>
+              <w:rPr>
+                <w:b/>
+                <w:color w:val="FFFFFF"/>
+                <w:sz w:val="19"/>
+              </w:rPr>
+              <w:t>Resumen</w:t>
+            </w:r>
+          </w:p>
+        </w:tc>
+        <w:tc>
+          <w:tcPr>
+            <w:tcW w:type="dxa" w:w="2835"/>
+            <w:shd w:val="clear" w:color="auto" w:fill="0B5CAD"/>
+          </w:tcPr>
+          <w:p>
+            <w:pPr>
+              <w:jc w:val="center"/>
+            </w:pPr>
+            <w:r/>
+            <w:r>
+              <w:rPr>
+                <w:b/>
+                <w:color w:val="FFFFFF"/>
+                <w:sz w:val="19"/>
+              </w:rPr>
+              <w:t>Puntos</w:t>
+            </w:r>
+          </w:p>
+        </w:tc>
+      </w:tr>
+      <w:tr>
+        <w:tc>
+          <w:tcPr>
+            <w:tcW w:type="dxa" w:w="6803"/>
+          </w:tcPr>
+          <w:p>
+            <w:r/>
+            <w:r>
+              <w:rPr>
+                <w:b/>
+                <w:sz w:val="19"/>
+              </w:rPr>
+              <w:t>Bloque 1</w:t>
+            </w:r>
+          </w:p>
+        </w:tc>
+        <w:tc>
+          <w:tcPr>
+            <w:tcW w:type="dxa" w:w="2835"/>
           </w:tcPr>
           <w:p>
             <w:pPr>
@@ -7272,6 +10084,147 @@
                 <w:b w:val="0"/>
                 <w:sz w:val="19"/>
               </w:rPr>
+              <w:t>____</w:t>
+            </w:r>
+          </w:p>
+        </w:tc>
+      </w:tr>
+      <w:tr>
+        <w:tc>
+          <w:tcPr>
+            <w:tcW w:type="dxa" w:w="6803"/>
+          </w:tcPr>
+          <w:p>
+            <w:r/>
+            <w:r>
+              <w:rPr>
+                <w:b/>
+                <w:sz w:val="19"/>
+              </w:rPr>
+              <w:t>Bloque 2</w:t>
+            </w:r>
+          </w:p>
+        </w:tc>
+        <w:tc>
+          <w:tcPr>
+            <w:tcW w:type="dxa" w:w="2835"/>
+          </w:tcPr>
+          <w:p>
+            <w:pPr>
+              <w:jc w:val="center"/>
+            </w:pPr>
+            <w:r/>
+            <w:r>
+              <w:rPr>
+                <w:b w:val="0"/>
+                <w:sz w:val="19"/>
+              </w:rPr>
+              <w:t>____</w:t>
+            </w:r>
+          </w:p>
+        </w:tc>
+      </w:tr>
+      <w:tr>
+        <w:tc>
+          <w:tcPr>
+            <w:tcW w:type="dxa" w:w="6803"/>
+          </w:tcPr>
+          <w:p>
+            <w:r/>
+            <w:r>
+              <w:rPr>
+                <w:b/>
+                <w:sz w:val="19"/>
+              </w:rPr>
+              <w:t>Bloque 3</w:t>
+            </w:r>
+          </w:p>
+        </w:tc>
+        <w:tc>
+          <w:tcPr>
+            <w:tcW w:type="dxa" w:w="2835"/>
+          </w:tcPr>
+          <w:p>
+            <w:pPr>
+              <w:jc w:val="center"/>
+            </w:pPr>
+            <w:r/>
+            <w:r>
+              <w:rPr>
+                <w:b w:val="0"/>
+                <w:sz w:val="19"/>
+              </w:rPr>
+              <w:t>____</w:t>
+            </w:r>
+          </w:p>
+        </w:tc>
+      </w:tr>
+      <w:tr>
+        <w:tc>
+          <w:tcPr>
+            <w:tcW w:type="dxa" w:w="6803"/>
+          </w:tcPr>
+          <w:p>
+            <w:r/>
+            <w:r>
+              <w:rPr>
+                <w:b/>
+                <w:sz w:val="19"/>
+              </w:rPr>
+              <w:t>Bloque 4</w:t>
+            </w:r>
+          </w:p>
+        </w:tc>
+        <w:tc>
+          <w:tcPr>
+            <w:tcW w:type="dxa" w:w="2835"/>
+          </w:tcPr>
+          <w:p>
+            <w:pPr>
+              <w:jc w:val="center"/>
+            </w:pPr>
+            <w:r/>
+            <w:r>
+              <w:rPr>
+                <w:b w:val="0"/>
+                <w:sz w:val="19"/>
+              </w:rPr>
+              <w:t>____</w:t>
+            </w:r>
+          </w:p>
+        </w:tc>
+      </w:tr>
+      <w:tr>
+        <w:tc>
+          <w:tcPr>
+            <w:tcW w:type="dxa" w:w="6803"/>
+          </w:tcPr>
+          <w:p>
+            <w:r/>
+            <w:r>
+              <w:rPr>
+                <w:b/>
+                <w:sz w:val="19"/>
+              </w:rPr>
+              <w:t>Nota final (0, 5, 10, 15 o 20)</w:t>
+            </w:r>
+          </w:p>
+        </w:tc>
+        <w:tc>
+          <w:tcPr>
+            <w:tcW w:type="dxa" w:w="2835"/>
+          </w:tcPr>
+          <w:p>
+            <w:pPr>
+              <w:jc w:val="center"/>
+            </w:pPr>
+            <w:r/>
+            <w:r>
+              <w:rPr>
+                <w:b w:val="0"/>
+                <w:sz w:val="19"/>
+              </w:rPr>
+              <w:t>____</w:t>
             </w:r>
           </w:p>
         </w:tc>

</xml_diff>